<commit_message>
docs: update lab 2 report and add compiled SRS
</commit_message>
<xml_diff>
--- a/docs/Lab2_PIS_Maistrenko.docx
+++ b/docs/Lab2_PIS_Maistrenko.docx
@@ -12,7 +12,7 @@
           <w:noProof/>
         </w:rPr>
         <w:drawing>
-          <wp:inline distT="0" distB="0" distL="0" distR="0" wp14:anchorId="1AF6E5C7" wp14:editId="0CD9C66F">
+          <wp:inline distT="0" distB="0" distL="0" distR="0" wp14:anchorId="2B37C01D" wp14:editId="14D1DA66">
             <wp:extent cx="3139440" cy="899160"/>
             <wp:effectExtent l="0" t="0" r="0" b="0"/>
             <wp:docPr id="14" name="image1.jpg"/>
@@ -340,13 +340,7 @@
         <w:jc w:val="center"/>
       </w:pPr>
       <w:r>
-        <w:t xml:space="preserve">Київ </w:t>
-      </w:r>
-      <w:r>
-        <w:t>-</w:t>
-      </w:r>
-      <w:r>
-        <w:t xml:space="preserve"> 2026</w:t>
+        <w:t>Київ - 2026</w:t>
       </w:r>
     </w:p>
     <w:p>
@@ -366,7 +360,8 @@
           <w:sz w:val="28"/>
           <w:szCs w:val="28"/>
         </w:rPr>
-        <w:t xml:space="preserve">Мета роботи</w:t>
+        <w:lastRenderedPageBreak/>
+        <w:t>Мета роботи</w:t>
       </w:r>
     </w:p>
     <w:p>
@@ -376,7 +371,7 @@
         <w:jc w:val="both"/>
       </w:pPr>
       <w:r>
-        <w:t xml:space="preserve">Опанувати побудову специфікації вимог до інформаційної системи в структурованому діалозі людини з мовною моделлю. Застосувати SKED для виявлення та уточнення вимог, сформувати функціональні й нефункціональні вимоги, критерії прийняття та BDD-сценарії. Створити базову специфікацію, яка після затвердження використовується як еталон у подальшому SDD-циклі.</w:t>
+        <w:t>Опанувати побудову специфікації вимог до інформаційної системи в структурованому діалозі людини з мовною моделлю. Застосувати SKED для виявлення та уточнення вимог, сформувати функціональні й нефункціональні вимоги, критерії прийняття та BDD-сценарії. Створити базову специфікацію, яка після затвердження використовується як еталон у подальшому SDD-циклі.</w:t>
       </w:r>
     </w:p>
     <w:p>
@@ -396,7 +391,7 @@
           <w:sz w:val="28"/>
           <w:szCs w:val="28"/>
         </w:rPr>
-        <w:t xml:space="preserve">1. Початковий задум системи</w:t>
+        <w:t>1. Початковий задум системи</w:t>
       </w:r>
     </w:p>
     <w:p>
@@ -406,7 +401,7 @@
         <w:jc w:val="both"/>
       </w:pPr>
       <w:r>
-        <w:t xml:space="preserve">Вхідним артефактом є репозиторій food-expenses-is з лабораторної роботи №1, початковий опис задуму spec/idea.md і запис про кодинговий агент logs/agent.md.</w:t>
+        <w:t>Вхідним артефактом є репозиторій food-expenses-is з лабораторної роботи №1, початковий опис задуму spec/idea.md і запис про кодинговий агент logs/agent.md.</w:t>
       </w:r>
     </w:p>
     <w:p>
@@ -416,7 +411,7 @@
         <w:jc w:val="both"/>
       </w:pPr>
       <w:r>
-        <w:t xml:space="preserve">Задум: інформаційна система для обліку щоденних витрат на харчування. Людина витрачає гроші на їжу дрібними сумами і в кінці місяця не може сказати, куди вони пішли. Система дозволяє записати покупку за кілька секунд і побачити підсумки за обраний період.</w:t>
+        <w:t>Задум: інформаційна система для обліку щоденних витрат на харчування. Людина витрачає гроші на їжу дрібними сумами і в кінці місяця не може сказати, куди вони пішли. Система дозволяє записати покупку за кілька секунд і побачити підсумки за обраний період.</w:t>
       </w:r>
     </w:p>
     <w:p>
@@ -426,7 +421,7 @@
         <w:jc w:val="both"/>
       </w:pPr>
       <w:r>
-        <w:t xml:space="preserve">До початкового набору питань SKED-діалогу увійшло відкрите питання з ЛР1: чи потрібні перегляд за довільний діапазон дат і суми за категоріями (Q-02, зафіксовано в logs/conflict.md).</w:t>
+        <w:t>До початкового набору питань SKED-діалогу увійшло відкрите питання з ЛР1: чи потрібні перегляд за довільний діапазон дат і суми за категоріями (Q-02, зафіксовано в logs/conflict.md).</w:t>
       </w:r>
     </w:p>
     <w:p>
@@ -446,7 +441,7 @@
           <w:sz w:val="28"/>
           <w:szCs w:val="28"/>
         </w:rPr>
-        <w:t xml:space="preserve">2. Перебіг SKED-діалогу</w:t>
+        <w:t>2. Перебіг SKED-діалогу</w:t>
       </w:r>
     </w:p>
     <w:p>
@@ -456,7 +451,7 @@
         <w:jc w:val="both"/>
       </w:pPr>
       <w:r>
-        <w:t xml:space="preserve">Перед початком діалогу моделі було вказано, що результатом має стати формальна специфікація, а її завдання на цьому етапі - не генерувати документ, а виявляти невизначеності й ставити уточнювальні запитання. Діалог пройшов у три блоки; документ не писався, доки не було узгоджено межі системи.</w:t>
+        <w:t>Перед початком діалогу моделі було вказано, що результатом має стати формальна специфікація, а її завдання на цьому етапі - не генерувати документ, а виявляти невизначеності й ставити уточнювальні запитання. Діалог пройшов у три блоки; документ не писався, доки не було узгоджено межі системи.</w:t>
       </w:r>
     </w:p>
     <w:tbl>
@@ -476,6 +471,7 @@
           <w:bottom w:w="40" w:type="dxa"/>
           <w:right w:w="80" w:type="dxa"/>
         </w:tblCellMar>
+        <w:tblLook w:val="04A0" w:firstRow="1" w:lastRow="0" w:firstColumn="1" w:lastColumn="0" w:noHBand="0" w:noVBand="1"/>
       </w:tblPr>
       <w:tblGrid>
         <w:gridCol w:w="900"/>
@@ -486,63 +482,51 @@
         <w:tc>
           <w:tcPr>
             <w:tcW w:w="900" w:type="dxa"/>
-            <w:shd w:val="clear" w:fill="D9E2F3"/>
-          </w:tcPr>
-          <w:p>
-            <w:pPr>
-              <w:spacing w:after="0" w:line="240" w:lineRule="auto"/>
-              <w:ind w:firstLine="0"/>
-              <w:jc w:val="left"/>
+            <w:shd w:val="clear" w:color="auto" w:fill="auto"/>
+          </w:tcPr>
+          <w:p>
+            <w:pPr>
+              <w:spacing w:line="360" w:lineRule="auto"/>
             </w:pPr>
             <w:r>
               <w:rPr>
-                <w:rFonts w:ascii="Times New Roman" w:hAnsi="Times New Roman"/>
-                <w:sz w:val="24"/>
                 <w:b/>
               </w:rPr>
-              <w:t xml:space="preserve">Блок</w:t>
+              <w:t>Блок</w:t>
             </w:r>
           </w:p>
         </w:tc>
         <w:tc>
           <w:tcPr>
             <w:tcW w:w="2600" w:type="dxa"/>
-            <w:shd w:val="clear" w:fill="D9E2F3"/>
-          </w:tcPr>
-          <w:p>
-            <w:pPr>
-              <w:spacing w:after="0" w:line="240" w:lineRule="auto"/>
-              <w:ind w:firstLine="0"/>
-              <w:jc w:val="left"/>
+            <w:shd w:val="clear" w:color="auto" w:fill="auto"/>
+          </w:tcPr>
+          <w:p>
+            <w:pPr>
+              <w:spacing w:line="360" w:lineRule="auto"/>
             </w:pPr>
             <w:r>
               <w:rPr>
-                <w:rFonts w:ascii="Times New Roman" w:hAnsi="Times New Roman"/>
-                <w:sz w:val="24"/>
                 <w:b/>
               </w:rPr>
-              <w:t xml:space="preserve">Про що</w:t>
+              <w:t>Про що</w:t>
             </w:r>
           </w:p>
         </w:tc>
         <w:tc>
           <w:tcPr>
             <w:tcW w:w="5855" w:type="dxa"/>
-            <w:shd w:val="clear" w:fill="D9E2F3"/>
-          </w:tcPr>
-          <w:p>
-            <w:pPr>
-              <w:spacing w:after="0" w:line="240" w:lineRule="auto"/>
-              <w:ind w:firstLine="0"/>
-              <w:jc w:val="left"/>
+            <w:shd w:val="clear" w:color="auto" w:fill="auto"/>
+          </w:tcPr>
+          <w:p>
+            <w:pPr>
+              <w:spacing w:line="360" w:lineRule="auto"/>
             </w:pPr>
             <w:r>
               <w:rPr>
-                <w:rFonts w:ascii="Times New Roman" w:hAnsi="Times New Roman"/>
-                <w:sz w:val="24"/>
                 <w:b/>
               </w:rPr>
-              <w:t xml:space="preserve">Результат</w:t>
+              <w:t>Результат</w:t>
             </w:r>
           </w:p>
         </w:tc>
@@ -551,57 +535,51 @@
         <w:tc>
           <w:tcPr>
             <w:tcW w:w="900" w:type="dxa"/>
-          </w:tcPr>
-          <w:p>
-            <w:pPr>
-              <w:spacing w:after="0" w:line="240" w:lineRule="auto"/>
-              <w:ind w:firstLine="0"/>
-              <w:jc w:val="left"/>
-            </w:pPr>
-            <w:r>
-              <w:rPr>
-                <w:rFonts w:ascii="Times New Roman" w:hAnsi="Times New Roman"/>
-                <w:sz w:val="24"/>
-              </w:rPr>
-              <w:t xml:space="preserve">1</w:t>
+            <w:shd w:val="clear" w:color="auto" w:fill="auto"/>
+          </w:tcPr>
+          <w:p>
+            <w:pPr>
+              <w:spacing w:line="360" w:lineRule="auto"/>
+            </w:pPr>
+            <w:r>
+              <w:t>1</w:t>
             </w:r>
           </w:p>
         </w:tc>
         <w:tc>
           <w:tcPr>
             <w:tcW w:w="2600" w:type="dxa"/>
-          </w:tcPr>
-          <w:p>
-            <w:pPr>
-              <w:spacing w:after="0" w:line="240" w:lineRule="auto"/>
-              <w:ind w:firstLine="0"/>
-              <w:jc w:val="left"/>
-            </w:pPr>
-            <w:r>
-              <w:rPr>
-                <w:rFonts w:ascii="Times New Roman" w:hAnsi="Times New Roman"/>
-                <w:sz w:val="24"/>
-              </w:rPr>
-              <w:t xml:space="preserve">Форма системи, технології, категорії, поля покупки, Q-02 з ЛР1</w:t>
+            <w:shd w:val="clear" w:color="auto" w:fill="auto"/>
+          </w:tcPr>
+          <w:p>
+            <w:pPr>
+              <w:spacing w:line="360" w:lineRule="auto"/>
+            </w:pPr>
+            <w:r>
+              <w:t xml:space="preserve">Форма системи, технології, категорії, поля </w:t>
+            </w:r>
+            <w:r>
+              <w:lastRenderedPageBreak/>
+              <w:t>покупки, Q-02 з ЛР1</w:t>
             </w:r>
           </w:p>
         </w:tc>
         <w:tc>
           <w:tcPr>
             <w:tcW w:w="5855" w:type="dxa"/>
-          </w:tcPr>
-          <w:p>
-            <w:pPr>
-              <w:spacing w:after="0" w:line="240" w:lineRule="auto"/>
-              <w:ind w:firstLine="0"/>
-              <w:jc w:val="left"/>
-            </w:pPr>
-            <w:r>
-              <w:rPr>
-                <w:rFonts w:ascii="Times New Roman" w:hAnsi="Times New Roman"/>
-                <w:sz w:val="24"/>
-              </w:rPr>
-              <w:t xml:space="preserve">Вебзастосунок, Python і SQLite, базові та власні категорії, обовʼязкова назва, дублікати дозволені, автоматичні дата й час, Q-02 вирішено на користь внесення до SRS</w:t>
+            <w:shd w:val="clear" w:color="auto" w:fill="auto"/>
+          </w:tcPr>
+          <w:p>
+            <w:pPr>
+              <w:spacing w:line="360" w:lineRule="auto"/>
+            </w:pPr>
+            <w:r>
+              <w:lastRenderedPageBreak/>
+              <w:t xml:space="preserve">Вебзастосунок, Python і SQLite, базові та власні категорії, обовʼязкова назва, дублікати </w:t>
+            </w:r>
+            <w:r>
+              <w:lastRenderedPageBreak/>
+              <w:t>дозволені, автоматичні дата й час, Q-02 вирішено на користь внесення до SRS</w:t>
             </w:r>
           </w:p>
         </w:tc>
@@ -613,16 +591,11 @@
           </w:tcPr>
           <w:p>
             <w:pPr>
-              <w:spacing w:after="0" w:line="240" w:lineRule="auto"/>
-              <w:ind w:firstLine="0"/>
-              <w:jc w:val="left"/>
-            </w:pPr>
-            <w:r>
-              <w:rPr>
-                <w:rFonts w:ascii="Times New Roman" w:hAnsi="Times New Roman"/>
-                <w:sz w:val="24"/>
-              </w:rPr>
-              <w:t xml:space="preserve">2</w:t>
+              <w:spacing w:line="360" w:lineRule="auto"/>
+            </w:pPr>
+            <w:r>
+              <w:lastRenderedPageBreak/>
+              <w:t>2</w:t>
             </w:r>
           </w:p>
         </w:tc>
@@ -632,16 +605,10 @@
           </w:tcPr>
           <w:p>
             <w:pPr>
-              <w:spacing w:after="0" w:line="240" w:lineRule="auto"/>
-              <w:ind w:firstLine="0"/>
-              <w:jc w:val="left"/>
-            </w:pPr>
-            <w:r>
-              <w:rPr>
-                <w:rFonts w:ascii="Times New Roman" w:hAnsi="Times New Roman"/>
-                <w:sz w:val="24"/>
-              </w:rPr>
-              <w:t xml:space="preserve">Наслідки рішень: кількість товару, видалення категорій, користувачі, валідація</w:t>
+              <w:spacing w:line="360" w:lineRule="auto"/>
+            </w:pPr>
+            <w:r>
+              <w:t>Наслідки рішень: кількість товару, видалення категорій, користувачі, валідація</w:t>
             </w:r>
           </w:p>
         </w:tc>
@@ -651,16 +618,10 @@
           </w:tcPr>
           <w:p>
             <w:pPr>
-              <w:spacing w:after="0" w:line="240" w:lineRule="auto"/>
-              <w:ind w:firstLine="0"/>
-              <w:jc w:val="left"/>
-            </w:pPr>
-            <w:r>
-              <w:rPr>
-                <w:rFonts w:ascii="Times New Roman" w:hAnsi="Times New Roman"/>
-                <w:sz w:val="24"/>
-              </w:rPr>
-              <w:t xml:space="preserve">Ціна за одиницю множиться на кількість, непорожня категорія не видаляється без попередження, потрібні профілі, правила перевірки даних</w:t>
+              <w:spacing w:line="360" w:lineRule="auto"/>
+            </w:pPr>
+            <w:r>
+              <w:t>Ціна за одиницю множиться на кількість, непорожня категорія не видаляється без попередження, потрібні профілі, правила перевірки даних</w:t>
             </w:r>
           </w:p>
         </w:tc>
@@ -672,16 +633,10 @@
           </w:tcPr>
           <w:p>
             <w:pPr>
-              <w:spacing w:after="0" w:line="240" w:lineRule="auto"/>
-              <w:ind w:firstLine="0"/>
-              <w:jc w:val="left"/>
-            </w:pPr>
-            <w:r>
-              <w:rPr>
-                <w:rFonts w:ascii="Times New Roman" w:hAnsi="Times New Roman"/>
-                <w:sz w:val="24"/>
-              </w:rPr>
-              <w:t xml:space="preserve">3</w:t>
+              <w:spacing w:line="360" w:lineRule="auto"/>
+            </w:pPr>
+            <w:r>
+              <w:t>3</w:t>
             </w:r>
           </w:p>
         </w:tc>
@@ -691,16 +646,10 @@
           </w:tcPr>
           <w:p>
             <w:pPr>
-              <w:spacing w:after="0" w:line="240" w:lineRule="auto"/>
-              <w:ind w:firstLine="0"/>
-              <w:jc w:val="left"/>
-            </w:pPr>
-            <w:r>
-              <w:rPr>
-                <w:rFonts w:ascii="Times New Roman" w:hAnsi="Times New Roman"/>
-                <w:sz w:val="24"/>
-              </w:rPr>
-              <w:t xml:space="preserve">Уточнення меж: реєстрація, ізоляція даних, графіки, стек</w:t>
+              <w:spacing w:line="360" w:lineRule="auto"/>
+            </w:pPr>
+            <w:r>
+              <w:t>Уточнення меж: реєстрація, ізоляція даних, графіки, стек</w:t>
             </w:r>
           </w:p>
         </w:tc>
@@ -710,16 +659,10 @@
           </w:tcPr>
           <w:p>
             <w:pPr>
-              <w:spacing w:after="0" w:line="240" w:lineRule="auto"/>
-              <w:ind w:firstLine="0"/>
-              <w:jc w:val="left"/>
-            </w:pPr>
-            <w:r>
-              <w:rPr>
-                <w:rFonts w:ascii="Times New Roman" w:hAnsi="Times New Roman"/>
-                <w:sz w:val="24"/>
-              </w:rPr>
-              <w:t xml:space="preserve">Профілі без пароля, дані ізольовані, графіки по днях місяця і по місяцях року, FastAPI і Chart.js, тексти двома мовами</w:t>
+              <w:spacing w:line="360" w:lineRule="auto"/>
+            </w:pPr>
+            <w:r>
+              <w:t>Профілі без пароля, дані ізольовані, графіки по днях місяця і по місяцях року, FastAPI і Chart.js, тексти двома мовами</w:t>
             </w:r>
           </w:p>
         </w:tc>
@@ -732,7 +675,245 @@
         <w:jc w:val="both"/>
       </w:pPr>
       <w:r>
-        <w:t xml:space="preserve">Підсумок діалогу збережено у logs/sked-session-01.md.</w:t>
+        <w:t>Підсумок діалогу збережено у logs/sked-session-01.md.</w:t>
+      </w:r>
+    </w:p>
+    <w:p>
+      <w:pPr>
+        <w:keepNext/>
+        <w:spacing w:before="120" w:line="360" w:lineRule="auto"/>
+        <w:jc w:val="center"/>
+      </w:pPr>
+      <w:r>
+        <w:rPr>
+          <w:noProof/>
+        </w:rPr>
+        <w:drawing>
+          <wp:inline distT="0" distB="0" distL="0" distR="0" wp14:anchorId="51B447EE" wp14:editId="0C385D3D">
+            <wp:extent cx="4601199" cy="3960000"/>
+            <wp:effectExtent l="0" t="0" r="0" b="0"/>
+            <wp:docPr id="701" name="Dialogue 1"/>
+            <wp:cNvGraphicFramePr>
+              <a:graphicFrameLocks xmlns:a="http://schemas.openxmlformats.org/drawingml/2006/main" noChangeAspect="1"/>
+            </wp:cNvGraphicFramePr>
+            <a:graphic xmlns:a="http://schemas.openxmlformats.org/drawingml/2006/main">
+              <a:graphicData uri="http://schemas.openxmlformats.org/drawingml/2006/picture">
+                <pic:pic xmlns:pic="http://schemas.openxmlformats.org/drawingml/2006/picture">
+                  <pic:nvPicPr>
+                    <pic:cNvPr id="0" name=""/>
+                    <pic:cNvPicPr>
+                      <a:picLocks noChangeAspect="1" noChangeArrowheads="1"/>
+                    </pic:cNvPicPr>
+                  </pic:nvPicPr>
+                  <pic:blipFill>
+                    <a:blip r:embed="rId6"/>
+                    <a:srcRect/>
+                    <a:stretch>
+                      <a:fillRect/>
+                    </a:stretch>
+                  </pic:blipFill>
+                  <pic:spPr bwMode="auto">
+                    <a:xfrm>
+                      <a:off x="0" y="0"/>
+                      <a:ext cx="4601199" cy="3960000"/>
+                    </a:xfrm>
+                    <a:prstGeom prst="rect">
+                      <a:avLst/>
+                    </a:prstGeom>
+                  </pic:spPr>
+                </pic:pic>
+              </a:graphicData>
+            </a:graphic>
+          </wp:inline>
+        </w:drawing>
+      </w:r>
+    </w:p>
+    <w:p>
+      <w:pPr>
+        <w:spacing w:after="200" w:line="360" w:lineRule="auto"/>
+        <w:jc w:val="center"/>
+      </w:pPr>
+      <w:r>
+        <w:t>Рисунок 1 - Блок 1 SKED-діалогу: запитання моделі та відповіді</w:t>
+      </w:r>
+    </w:p>
+    <w:p>
+      <w:pPr>
+        <w:keepNext/>
+        <w:spacing w:before="120" w:line="360" w:lineRule="auto"/>
+        <w:jc w:val="center"/>
+      </w:pPr>
+      <w:r>
+        <w:rPr>
+          <w:noProof/>
+        </w:rPr>
+        <w:lastRenderedPageBreak/>
+        <w:drawing>
+          <wp:inline distT="0" distB="0" distL="0" distR="0" wp14:anchorId="695DB696" wp14:editId="4B3298FE">
+            <wp:extent cx="5573607" cy="3960000"/>
+            <wp:effectExtent l="0" t="0" r="0" b="0"/>
+            <wp:docPr id="702" name="Dialogue 2"/>
+            <wp:cNvGraphicFramePr>
+              <a:graphicFrameLocks xmlns:a="http://schemas.openxmlformats.org/drawingml/2006/main" noChangeAspect="1"/>
+            </wp:cNvGraphicFramePr>
+            <a:graphic xmlns:a="http://schemas.openxmlformats.org/drawingml/2006/main">
+              <a:graphicData uri="http://schemas.openxmlformats.org/drawingml/2006/picture">
+                <pic:pic xmlns:pic="http://schemas.openxmlformats.org/drawingml/2006/picture">
+                  <pic:nvPicPr>
+                    <pic:cNvPr id="0" name=""/>
+                    <pic:cNvPicPr>
+                      <a:picLocks noChangeAspect="1" noChangeArrowheads="1"/>
+                    </pic:cNvPicPr>
+                  </pic:nvPicPr>
+                  <pic:blipFill>
+                    <a:blip r:embed="rId7"/>
+                    <a:srcRect/>
+                    <a:stretch>
+                      <a:fillRect/>
+                    </a:stretch>
+                  </pic:blipFill>
+                  <pic:spPr bwMode="auto">
+                    <a:xfrm>
+                      <a:off x="0" y="0"/>
+                      <a:ext cx="5573607" cy="3960000"/>
+                    </a:xfrm>
+                    <a:prstGeom prst="rect">
+                      <a:avLst/>
+                    </a:prstGeom>
+                  </pic:spPr>
+                </pic:pic>
+              </a:graphicData>
+            </a:graphic>
+          </wp:inline>
+        </w:drawing>
+      </w:r>
+    </w:p>
+    <w:p>
+      <w:pPr>
+        <w:spacing w:after="200" w:line="360" w:lineRule="auto"/>
+        <w:jc w:val="center"/>
+      </w:pPr>
+      <w:r>
+        <w:t>Рисунок 2 - Блок 2: запитання про наслідки прийнятих рішень</w:t>
+      </w:r>
+    </w:p>
+    <w:p>
+      <w:pPr>
+        <w:keepNext/>
+        <w:spacing w:before="120" w:line="360" w:lineRule="auto"/>
+        <w:jc w:val="center"/>
+      </w:pPr>
+      <w:r>
+        <w:rPr>
+          <w:noProof/>
+        </w:rPr>
+        <w:drawing>
+          <wp:inline distT="0" distB="0" distL="0" distR="0" wp14:anchorId="6F2435D1" wp14:editId="5B318231">
+            <wp:extent cx="5580000" cy="2360509"/>
+            <wp:effectExtent l="0" t="0" r="0" b="0"/>
+            <wp:docPr id="703" name="Dialogue 3"/>
+            <wp:cNvGraphicFramePr>
+              <a:graphicFrameLocks xmlns:a="http://schemas.openxmlformats.org/drawingml/2006/main" noChangeAspect="1"/>
+            </wp:cNvGraphicFramePr>
+            <a:graphic xmlns:a="http://schemas.openxmlformats.org/drawingml/2006/main">
+              <a:graphicData uri="http://schemas.openxmlformats.org/drawingml/2006/picture">
+                <pic:pic xmlns:pic="http://schemas.openxmlformats.org/drawingml/2006/picture">
+                  <pic:nvPicPr>
+                    <pic:cNvPr id="0" name=""/>
+                    <pic:cNvPicPr>
+                      <a:picLocks noChangeAspect="1" noChangeArrowheads="1"/>
+                    </pic:cNvPicPr>
+                  </pic:nvPicPr>
+                  <pic:blipFill>
+                    <a:blip r:embed="rId8"/>
+                    <a:srcRect/>
+                    <a:stretch>
+                      <a:fillRect/>
+                    </a:stretch>
+                  </pic:blipFill>
+                  <pic:spPr bwMode="auto">
+                    <a:xfrm>
+                      <a:off x="0" y="0"/>
+                      <a:ext cx="5580000" cy="2360509"/>
+                    </a:xfrm>
+                    <a:prstGeom prst="rect">
+                      <a:avLst/>
+                    </a:prstGeom>
+                  </pic:spPr>
+                </pic:pic>
+              </a:graphicData>
+            </a:graphic>
+          </wp:inline>
+        </w:drawing>
+      </w:r>
+    </w:p>
+    <w:p>
+      <w:pPr>
+        <w:spacing w:after="200" w:line="360" w:lineRule="auto"/>
+        <w:jc w:val="center"/>
+      </w:pPr>
+      <w:r>
+        <w:t>Рисунок 3 - Блок 2: відповіді та уточнення меж системи</w:t>
+      </w:r>
+    </w:p>
+    <w:p>
+      <w:pPr>
+        <w:keepNext/>
+        <w:spacing w:before="120" w:line="360" w:lineRule="auto"/>
+        <w:jc w:val="center"/>
+      </w:pPr>
+      <w:r>
+        <w:rPr>
+          <w:noProof/>
+        </w:rPr>
+        <w:lastRenderedPageBreak/>
+        <w:drawing>
+          <wp:inline distT="0" distB="0" distL="0" distR="0" wp14:anchorId="155C87F7" wp14:editId="19D8D35E">
+            <wp:extent cx="5179448" cy="3960000"/>
+            <wp:effectExtent l="0" t="0" r="0" b="0"/>
+            <wp:docPr id="704" name="Dialogue 4"/>
+            <wp:cNvGraphicFramePr>
+              <a:graphicFrameLocks xmlns:a="http://schemas.openxmlformats.org/drawingml/2006/main" noChangeAspect="1"/>
+            </wp:cNvGraphicFramePr>
+            <a:graphic xmlns:a="http://schemas.openxmlformats.org/drawingml/2006/main">
+              <a:graphicData uri="http://schemas.openxmlformats.org/drawingml/2006/picture">
+                <pic:pic xmlns:pic="http://schemas.openxmlformats.org/drawingml/2006/picture">
+                  <pic:nvPicPr>
+                    <pic:cNvPr id="0" name=""/>
+                    <pic:cNvPicPr>
+                      <a:picLocks noChangeAspect="1" noChangeArrowheads="1"/>
+                    </pic:cNvPicPr>
+                  </pic:nvPicPr>
+                  <pic:blipFill>
+                    <a:blip r:embed="rId9"/>
+                    <a:srcRect/>
+                    <a:stretch>
+                      <a:fillRect/>
+                    </a:stretch>
+                  </pic:blipFill>
+                  <pic:spPr bwMode="auto">
+                    <a:xfrm>
+                      <a:off x="0" y="0"/>
+                      <a:ext cx="5179448" cy="3960000"/>
+                    </a:xfrm>
+                    <a:prstGeom prst="rect">
+                      <a:avLst/>
+                    </a:prstGeom>
+                  </pic:spPr>
+                </pic:pic>
+              </a:graphicData>
+            </a:graphic>
+          </wp:inline>
+        </w:drawing>
+      </w:r>
+    </w:p>
+    <w:p>
+      <w:pPr>
+        <w:spacing w:after="200" w:line="360" w:lineRule="auto"/>
+        <w:jc w:val="center"/>
+      </w:pPr>
+      <w:r>
+        <w:t>Рисунок 4 - Блок 3: уточнення профілів, графіків і технологій</w:t>
       </w:r>
     </w:p>
     <w:p>
@@ -752,7 +933,7 @@
           <w:sz w:val="28"/>
           <w:szCs w:val="28"/>
         </w:rPr>
-        <w:t xml:space="preserve">3. Ключові уточнення</w:t>
+        <w:t>3. Ключові уточнення</w:t>
       </w:r>
     </w:p>
     <w:p>
@@ -766,7 +947,7 @@
         <w:jc w:val="both"/>
       </w:pPr>
       <w:r>
-        <w:t xml:space="preserve">вартість покупки обчислюється як ціна за одиницю, помножена на кількість, тому для товару на вагу вводиться ціна за кілограм;</w:t>
+        <w:t>вартість покупки обчислюється як ціна за одиницю, помножена на кількість, тому для товару на вагу вводиться ціна за кілограм;</w:t>
       </w:r>
     </w:p>
     <w:p>
@@ -780,7 +961,7 @@
         <w:jc w:val="both"/>
       </w:pPr>
       <w:r>
-        <w:t xml:space="preserve">непорожню категорію видалити не можна; після підтвердження її покупки переносяться до категорії «Інше»;</w:t>
+        <w:t>непорожню категорію видалити не можна; після підтвердження її покупки переносяться до категорії «Інше»;</w:t>
       </w:r>
     </w:p>
     <w:p>
@@ -794,7 +975,7 @@
         <w:jc w:val="both"/>
       </w:pPr>
       <w:r>
-        <w:t xml:space="preserve">дата й час проставляються автоматично, але їх можна змінити, і підсумки перераховуються;</w:t>
+        <w:t>дата й час проставляються автоматично, але їх можна змінити, і підсумки перераховуються;</w:t>
       </w:r>
     </w:p>
     <w:p>
@@ -808,7 +989,7 @@
         <w:jc w:val="both"/>
       </w:pPr>
       <w:r>
-        <w:t xml:space="preserve">профілі потрібні лише для розмежування даних, тому пароль не використовується;</w:t>
+        <w:t>профілі потрібні лише для розмежування даних, тому пароль не використовується;</w:t>
       </w:r>
     </w:p>
     <w:p>
@@ -822,19 +1003,13 @@
         <w:jc w:val="both"/>
       </w:pPr>
       <w:r>
-        <w:t xml:space="preserve">поле «кількість» - рішення людини, у початковому задумі його не було.</w:t>
+        <w:t>поле «кількість» - рішення людини, у початковому задумі його не було.</w:t>
       </w:r>
     </w:p>
     <w:p>
       <w:pPr>
         <w:pStyle w:val="1"/>
         <w:spacing w:before="240" w:after="120" w:line="360" w:lineRule="auto"/>
-        <w:rPr>
-          <w:sz w:val="28"/>
-          <w:szCs w:val="28"/>
-        </w:rPr>
-      </w:pPr>
-      <w:r>
         <w:rPr>
           <w:b/>
           <w:bCs/>
@@ -842,8 +1017,74 @@
           <w:sz w:val="28"/>
           <w:szCs w:val="28"/>
         </w:rPr>
-        <w:t xml:space="preserve">4. Припущення моделі, які було виправлено або відхилено</w:t>
-      </w:r>
+      </w:pPr>
+      <w:r>
+        <w:rPr>
+          <w:b/>
+          <w:bCs/>
+          <w:color w:val="000000"/>
+          <w:sz w:val="28"/>
+          <w:szCs w:val="28"/>
+        </w:rPr>
+        <w:t xml:space="preserve">4. Припущення моделі, які було </w:t>
+      </w:r>
+      <w:proofErr w:type="spellStart"/>
+      <w:r>
+        <w:rPr>
+          <w:b/>
+          <w:bCs/>
+          <w:color w:val="000000"/>
+          <w:sz w:val="28"/>
+          <w:szCs w:val="28"/>
+        </w:rPr>
+        <w:t>виправлено</w:t>
+      </w:r>
+      <w:proofErr w:type="spellEnd"/>
+      <w:r>
+        <w:rPr>
+          <w:b/>
+          <w:bCs/>
+          <w:color w:val="000000"/>
+          <w:sz w:val="28"/>
+          <w:szCs w:val="28"/>
+        </w:rPr>
+        <w:t xml:space="preserve"> або </w:t>
+      </w:r>
+      <w:proofErr w:type="spellStart"/>
+      <w:r>
+        <w:rPr>
+          <w:b/>
+          <w:bCs/>
+          <w:color w:val="000000"/>
+          <w:sz w:val="28"/>
+          <w:szCs w:val="28"/>
+        </w:rPr>
+        <w:t>відхилено</w:t>
+      </w:r>
+      <w:proofErr w:type="spellEnd"/>
+    </w:p>
+    <w:p>
+      <w:pPr>
+        <w:pStyle w:val="1"/>
+        <w:spacing w:before="240" w:after="120" w:line="360" w:lineRule="auto"/>
+        <w:rPr>
+          <w:b/>
+          <w:bCs/>
+          <w:color w:val="000000"/>
+          <w:sz w:val="28"/>
+          <w:szCs w:val="28"/>
+        </w:rPr>
+      </w:pPr>
+    </w:p>
+    <w:p>
+      <w:pPr>
+        <w:pStyle w:val="1"/>
+        <w:spacing w:before="240" w:after="120" w:line="360" w:lineRule="auto"/>
+        <w:rPr>
+          <w:sz w:val="28"/>
+          <w:szCs w:val="28"/>
+        </w:rPr>
+      </w:pPr>
     </w:p>
     <w:tbl>
       <w:tblPr>
@@ -862,6 +1103,7 @@
           <w:bottom w:w="40" w:type="dxa"/>
           <w:right w:w="80" w:type="dxa"/>
         </w:tblCellMar>
+        <w:tblLook w:val="04A0" w:firstRow="1" w:lastRow="0" w:firstColumn="1" w:lastColumn="0" w:noHBand="0" w:noVBand="1"/>
       </w:tblPr>
       <w:tblGrid>
         <w:gridCol w:w="4600"/>
@@ -871,42 +1113,35 @@
         <w:tc>
           <w:tcPr>
             <w:tcW w:w="4600" w:type="dxa"/>
-            <w:shd w:val="clear" w:fill="D9E2F3"/>
-          </w:tcPr>
-          <w:p>
-            <w:pPr>
-              <w:spacing w:after="0" w:line="240" w:lineRule="auto"/>
-              <w:ind w:firstLine="0"/>
-              <w:jc w:val="left"/>
+            <w:shd w:val="clear" w:color="auto" w:fill="auto"/>
+          </w:tcPr>
+          <w:p>
+            <w:pPr>
+              <w:spacing w:line="360" w:lineRule="auto"/>
             </w:pPr>
             <w:r>
               <w:rPr>
-                <w:rFonts w:ascii="Times New Roman" w:hAnsi="Times New Roman"/>
-                <w:sz w:val="24"/>
                 <w:b/>
               </w:rPr>
-              <w:t xml:space="preserve">Припущення моделі</w:t>
+              <w:lastRenderedPageBreak/>
+              <w:t>Припущення моделі</w:t>
             </w:r>
           </w:p>
         </w:tc>
         <w:tc>
           <w:tcPr>
             <w:tcW w:w="4755" w:type="dxa"/>
-            <w:shd w:val="clear" w:fill="D9E2F3"/>
-          </w:tcPr>
-          <w:p>
-            <w:pPr>
-              <w:spacing w:after="0" w:line="240" w:lineRule="auto"/>
-              <w:ind w:firstLine="0"/>
-              <w:jc w:val="left"/>
+            <w:shd w:val="clear" w:color="auto" w:fill="auto"/>
+          </w:tcPr>
+          <w:p>
+            <w:pPr>
+              <w:spacing w:line="360" w:lineRule="auto"/>
             </w:pPr>
             <w:r>
               <w:rPr>
-                <w:rFonts w:ascii="Times New Roman" w:hAnsi="Times New Roman"/>
-                <w:sz w:val="24"/>
                 <w:b/>
               </w:rPr>
-              <w:t xml:space="preserve">Рішення людини</w:t>
+              <w:t>Рішення людини</w:t>
             </w:r>
           </w:p>
         </w:tc>
@@ -918,16 +1153,10 @@
           </w:tcPr>
           <w:p>
             <w:pPr>
-              <w:spacing w:after="0" w:line="240" w:lineRule="auto"/>
-              <w:ind w:firstLine="0"/>
-              <w:jc w:val="left"/>
-            </w:pPr>
-            <w:r>
-              <w:rPr>
-                <w:rFonts w:ascii="Times New Roman" w:hAnsi="Times New Roman"/>
-                <w:sz w:val="24"/>
-              </w:rPr>
-              <w:t xml:space="preserve">Логін і пароль із хешуванням як спосіб розмежувати дані</w:t>
+              <w:spacing w:line="360" w:lineRule="auto"/>
+            </w:pPr>
+            <w:r>
+              <w:t>Логін і пароль із хешуванням як спосіб розмежувати дані</w:t>
             </w:r>
           </w:p>
         </w:tc>
@@ -937,16 +1166,10 @@
           </w:tcPr>
           <w:p>
             <w:pPr>
-              <w:spacing w:after="0" w:line="240" w:lineRule="auto"/>
-              <w:ind w:firstLine="0"/>
-              <w:jc w:val="left"/>
-            </w:pPr>
-            <w:r>
-              <w:rPr>
-                <w:rFonts w:ascii="Times New Roman" w:hAnsi="Times New Roman"/>
-                <w:sz w:val="24"/>
-              </w:rPr>
-              <w:t xml:space="preserve">Відхилено: профілі без пароля, автентифікація поза межами версії</w:t>
+              <w:spacing w:line="360" w:lineRule="auto"/>
+            </w:pPr>
+            <w:r>
+              <w:t>Відхилено: профілі без пароля, автентифікація поза межами версії</w:t>
             </w:r>
           </w:p>
         </w:tc>
@@ -958,16 +1181,10 @@
           </w:tcPr>
           <w:p>
             <w:pPr>
-              <w:spacing w:after="0" w:line="240" w:lineRule="auto"/>
-              <w:ind w:firstLine="0"/>
-              <w:jc w:val="left"/>
-            </w:pPr>
-            <w:r>
-              <w:rPr>
-                <w:rFonts w:ascii="Times New Roman" w:hAnsi="Times New Roman"/>
-                <w:sz w:val="24"/>
-              </w:rPr>
-              <w:t xml:space="preserve">Показувати розбивку за категоріями діаграмою</w:t>
+              <w:spacing w:line="360" w:lineRule="auto"/>
+            </w:pPr>
+            <w:r>
+              <w:t>Показувати розбивку за категоріями діаграмою</w:t>
             </w:r>
           </w:p>
         </w:tc>
@@ -977,16 +1194,10 @@
           </w:tcPr>
           <w:p>
             <w:pPr>
-              <w:spacing w:after="0" w:line="240" w:lineRule="auto"/>
-              <w:ind w:firstLine="0"/>
-              <w:jc w:val="left"/>
-            </w:pPr>
-            <w:r>
-              <w:rPr>
-                <w:rFonts w:ascii="Times New Roman" w:hAnsi="Times New Roman"/>
-                <w:sz w:val="24"/>
-              </w:rPr>
-              <w:t xml:space="preserve">Виправлено: категорії виводяться таблицею, графіки - по днях і місяцях</w:t>
+              <w:spacing w:line="360" w:lineRule="auto"/>
+            </w:pPr>
+            <w:r>
+              <w:t>Виправлено: категорії виводяться таблицею, графіки - по днях і місяцях</w:t>
             </w:r>
           </w:p>
         </w:tc>
@@ -998,16 +1209,10 @@
           </w:tcPr>
           <w:p>
             <w:pPr>
-              <w:spacing w:after="0" w:line="240" w:lineRule="auto"/>
-              <w:ind w:firstLine="0"/>
-              <w:jc w:val="left"/>
-            </w:pPr>
-            <w:r>
-              <w:rPr>
-                <w:rFonts w:ascii="Times New Roman" w:hAnsi="Times New Roman"/>
-                <w:sz w:val="24"/>
-              </w:rPr>
-              <w:t xml:space="preserve">Ввести верхню межу суми покупки у правила перевірки</w:t>
+              <w:spacing w:line="360" w:lineRule="auto"/>
+            </w:pPr>
+            <w:r>
+              <w:t>Ввести верхню межу суми покупки у правила перевірки</w:t>
             </w:r>
           </w:p>
         </w:tc>
@@ -1017,16 +1222,10 @@
           </w:tcPr>
           <w:p>
             <w:pPr>
-              <w:spacing w:after="0" w:line="240" w:lineRule="auto"/>
-              <w:ind w:firstLine="0"/>
-              <w:jc w:val="left"/>
-            </w:pPr>
-            <w:r>
-              <w:rPr>
-                <w:rFonts w:ascii="Times New Roman" w:hAnsi="Times New Roman"/>
-                <w:sz w:val="24"/>
-              </w:rPr>
-              <w:t xml:space="preserve">Відхилено: обмеження зверху немає</w:t>
+              <w:spacing w:line="360" w:lineRule="auto"/>
+            </w:pPr>
+            <w:r>
+              <w:t>Відхилено: обмеження зверху немає</w:t>
             </w:r>
           </w:p>
         </w:tc>
@@ -1038,16 +1237,10 @@
           </w:tcPr>
           <w:p>
             <w:pPr>
-              <w:spacing w:after="0" w:line="240" w:lineRule="auto"/>
-              <w:ind w:firstLine="0"/>
-              <w:jc w:val="left"/>
-            </w:pPr>
-            <w:r>
-              <w:rPr>
-                <w:rFonts w:ascii="Times New Roman" w:hAnsi="Times New Roman"/>
-                <w:sz w:val="24"/>
-              </w:rPr>
-              <w:t xml:space="preserve">Залишити обмеження «одна людина» з ЛР1 чинним</w:t>
+              <w:spacing w:line="360" w:lineRule="auto"/>
+            </w:pPr>
+            <w:r>
+              <w:t>Залишити обмеження «одна людина» з ЛР1 чинним</w:t>
             </w:r>
           </w:p>
         </w:tc>
@@ -1057,16 +1250,13 @@
           </w:tcPr>
           <w:p>
             <w:pPr>
-              <w:spacing w:after="0" w:line="240" w:lineRule="auto"/>
-              <w:ind w:firstLine="0"/>
-              <w:jc w:val="left"/>
-            </w:pPr>
-            <w:r>
-              <w:rPr>
-                <w:rFonts w:ascii="Times New Roman" w:hAnsi="Times New Roman"/>
-                <w:sz w:val="24"/>
-              </w:rPr>
-              <w:t xml:space="preserve">Змінено людиною: система стала багатопрофільною, зміну внесено до spec/idea.md</w:t>
+              <w:spacing w:line="360" w:lineRule="auto"/>
+            </w:pPr>
+            <w:r>
+              <w:t>Змінено людиною: система стала багатопрофільною, зм</w:t>
+            </w:r>
+            <w:r>
+              <w:t>іну внесено до spec/idea.md</w:t>
             </w:r>
           </w:p>
         </w:tc>
@@ -1089,7 +1279,7 @@
           <w:sz w:val="28"/>
           <w:szCs w:val="28"/>
         </w:rPr>
-        <w:t xml:space="preserve">5. Зміни меж відносно ЛР1</w:t>
+        <w:t>5. Зміни меж відносно ЛР1</w:t>
       </w:r>
     </w:p>
     <w:p>
@@ -1099,7 +1289,7 @@
         <w:jc w:val="both"/>
       </w:pPr>
       <w:r>
-        <w:t xml:space="preserve">Три рішення розширили межі, зафіксовані в ЛР1: багатопрофільність замість одного користувача, проста аналітика (розбивка за категоріями і стовпчикові графіки) замість повної відмови від аналітики, а також облік кількості товару з ціною за одиницю. Щоб специфікація не суперечила задуму, ці зміни внесено до spec/idea.md окремим розділом.</w:t>
+        <w:t>Три рішення розширили межі, зафіксовані в ЛР1: багатопрофільність замість одного користувача, проста аналітика (розбивка за категоріями і стовпчикові графіки) замість повної відмови від аналітики, а також облік кількості товару з ціною за одиницю. Щоб специфікація не суперечила задуму, ці зміни внесено до spec/idea.md окремим розділом.</w:t>
       </w:r>
     </w:p>
     <w:p>
@@ -1112,8 +1302,9 @@
         <w:rPr>
           <w:noProof/>
         </w:rPr>
+        <w:lastRenderedPageBreak/>
         <w:drawing>
-          <wp:inline distT="0" distB="0" distL="0" distR="0" wp14:anchorId="323B3B59" wp14:editId="2560A23F">
+          <wp:inline distT="0" distB="0" distL="0" distR="0" wp14:anchorId="2E317F50" wp14:editId="3BEDE273">
             <wp:extent cx="5752663" cy="6840000"/>
             <wp:effectExtent l="0" t="0" r="0" b="0"/>
             <wp:docPr id="901" name="Picture 901"/>
@@ -1130,7 +1321,7 @@
                     </pic:cNvPicPr>
                   </pic:nvPicPr>
                   <pic:blipFill>
-                    <a:blip r:embed="rIdL22"/>
+                    <a:blip r:embed="rId10"/>
                     <a:srcRect/>
                     <a:stretch>
                       <a:fillRect/>
@@ -1158,7 +1349,7 @@
         <w:jc w:val="center"/>
       </w:pPr>
       <w:r>
-        <w:t xml:space="preserve">Рисунок 1 - Коміти глосарія, SRS, сценаріїв і матриці простежуваності</w:t>
+        <w:t>Рисунок 5 - Коміти глосарія, SRS, сценаріїв і матриці простежуваності</w:t>
       </w:r>
     </w:p>
     <w:p>
@@ -1178,7 +1369,7 @@
           <w:sz w:val="28"/>
           <w:szCs w:val="28"/>
         </w:rPr>
-        <w:t xml:space="preserve">6. Глосарій предметної області</w:t>
+        <w:t>6. Глосарій предметної області</w:t>
       </w:r>
     </w:p>
     <w:p>
@@ -1188,8 +1379,30 @@
         <w:jc w:val="both"/>
       </w:pPr>
       <w:r>
-        <w:t xml:space="preserve">Для ключових понять встановлено єдині назви, які використовуються у специфікації, сценаріях, тестах і коді. Повний перелік - spec/glossary.md.</w:t>
-      </w:r>
+        <w:t xml:space="preserve">Для ключових понять встановлено єдині назви, які використовуються у специфікації, сценаріях, тестах і коді. Повний перелік - </w:t>
+      </w:r>
+      <w:proofErr w:type="spellStart"/>
+      <w:r>
+        <w:t>spec</w:t>
+      </w:r>
+      <w:proofErr w:type="spellEnd"/>
+      <w:r>
+        <w:t>/glossary.md.</w:t>
+      </w:r>
+    </w:p>
+    <w:p>
+      <w:pPr>
+        <w:spacing w:after="120" w:line="360" w:lineRule="auto"/>
+        <w:ind w:firstLine="567"/>
+        <w:jc w:val="both"/>
+      </w:pPr>
+    </w:p>
+    <w:p>
+      <w:pPr>
+        <w:spacing w:after="120" w:line="360" w:lineRule="auto"/>
+        <w:ind w:firstLine="567"/>
+        <w:jc w:val="both"/>
+      </w:pPr>
     </w:p>
     <w:tbl>
       <w:tblPr>
@@ -1208,6 +1421,7 @@
           <w:bottom w:w="40" w:type="dxa"/>
           <w:right w:w="80" w:type="dxa"/>
         </w:tblCellMar>
+        <w:tblLook w:val="04A0" w:firstRow="1" w:lastRow="0" w:firstColumn="1" w:lastColumn="0" w:noHBand="0" w:noVBand="1"/>
       </w:tblPr>
       <w:tblGrid>
         <w:gridCol w:w="2600"/>
@@ -1217,42 +1431,35 @@
         <w:tc>
           <w:tcPr>
             <w:tcW w:w="2600" w:type="dxa"/>
-            <w:shd w:val="clear" w:fill="D9E2F3"/>
-          </w:tcPr>
-          <w:p>
-            <w:pPr>
-              <w:spacing w:after="0" w:line="240" w:lineRule="auto"/>
-              <w:ind w:firstLine="0"/>
-              <w:jc w:val="left"/>
+            <w:shd w:val="clear" w:color="auto" w:fill="auto"/>
+          </w:tcPr>
+          <w:p>
+            <w:pPr>
+              <w:spacing w:line="360" w:lineRule="auto"/>
             </w:pPr>
             <w:r>
               <w:rPr>
-                <w:rFonts w:ascii="Times New Roman" w:hAnsi="Times New Roman"/>
-                <w:sz w:val="24"/>
                 <w:b/>
               </w:rPr>
-              <w:t xml:space="preserve">Термін</w:t>
+              <w:lastRenderedPageBreak/>
+              <w:t>Термін</w:t>
             </w:r>
           </w:p>
         </w:tc>
         <w:tc>
           <w:tcPr>
             <w:tcW w:w="6755" w:type="dxa"/>
-            <w:shd w:val="clear" w:fill="D9E2F3"/>
-          </w:tcPr>
-          <w:p>
-            <w:pPr>
-              <w:spacing w:after="0" w:line="240" w:lineRule="auto"/>
-              <w:ind w:firstLine="0"/>
-              <w:jc w:val="left"/>
+            <w:shd w:val="clear" w:color="auto" w:fill="auto"/>
+          </w:tcPr>
+          <w:p>
+            <w:pPr>
+              <w:spacing w:line="360" w:lineRule="auto"/>
             </w:pPr>
             <w:r>
               <w:rPr>
-                <w:rFonts w:ascii="Times New Roman" w:hAnsi="Times New Roman"/>
-                <w:sz w:val="24"/>
                 <w:b/>
               </w:rPr>
-              <w:t xml:space="preserve">Визначення</w:t>
+              <w:t>Визначення</w:t>
             </w:r>
           </w:p>
         </w:tc>
@@ -1264,16 +1471,10 @@
           </w:tcPr>
           <w:p>
             <w:pPr>
-              <w:spacing w:after="0" w:line="240" w:lineRule="auto"/>
-              <w:ind w:firstLine="0"/>
-              <w:jc w:val="left"/>
-            </w:pPr>
-            <w:r>
-              <w:rPr>
-                <w:rFonts w:ascii="Times New Roman" w:hAnsi="Times New Roman"/>
-                <w:sz w:val="24"/>
-              </w:rPr>
-              <w:t xml:space="preserve">Профіль</w:t>
+              <w:spacing w:line="360" w:lineRule="auto"/>
+            </w:pPr>
+            <w:r>
+              <w:t>Профіль</w:t>
             </w:r>
           </w:p>
         </w:tc>
@@ -1283,16 +1484,10 @@
           </w:tcPr>
           <w:p>
             <w:pPr>
-              <w:spacing w:after="0" w:line="240" w:lineRule="auto"/>
-              <w:ind w:firstLine="0"/>
-              <w:jc w:val="left"/>
-            </w:pPr>
-            <w:r>
-              <w:rPr>
-                <w:rFonts w:ascii="Times New Roman" w:hAnsi="Times New Roman"/>
-                <w:sz w:val="24"/>
-              </w:rPr>
-              <w:t xml:space="preserve">Іменований набір даних однієї людини: її покупки і категорії; пароля не має</w:t>
+              <w:spacing w:line="360" w:lineRule="auto"/>
+            </w:pPr>
+            <w:r>
+              <w:t>Іменований набір даних однієї людини: її покупки і категорії; пароля не має</w:t>
             </w:r>
           </w:p>
         </w:tc>
@@ -1304,16 +1499,10 @@
           </w:tcPr>
           <w:p>
             <w:pPr>
-              <w:spacing w:after="0" w:line="240" w:lineRule="auto"/>
-              <w:ind w:firstLine="0"/>
-              <w:jc w:val="left"/>
-            </w:pPr>
-            <w:r>
-              <w:rPr>
-                <w:rFonts w:ascii="Times New Roman" w:hAnsi="Times New Roman"/>
-                <w:sz w:val="24"/>
-              </w:rPr>
-              <w:t xml:space="preserve">Покупка</w:t>
+              <w:spacing w:line="360" w:lineRule="auto"/>
+            </w:pPr>
+            <w:r>
+              <w:t>Покупка</w:t>
             </w:r>
           </w:p>
         </w:tc>
@@ -1323,16 +1512,10 @@
           </w:tcPr>
           <w:p>
             <w:pPr>
-              <w:spacing w:after="0" w:line="240" w:lineRule="auto"/>
-              <w:ind w:firstLine="0"/>
-              <w:jc w:val="left"/>
-            </w:pPr>
-            <w:r>
-              <w:rPr>
-                <w:rFonts w:ascii="Times New Roman" w:hAnsi="Times New Roman"/>
-                <w:sz w:val="24"/>
-              </w:rPr>
-              <w:t xml:space="preserve">Запис про витрату: назва, категорія, ціна за одиницю, кількість, дата й час</w:t>
+              <w:spacing w:line="360" w:lineRule="auto"/>
+            </w:pPr>
+            <w:r>
+              <w:t>Запис про витрату: назва, категорія, ціна за одиницю, кількість, дата й час</w:t>
             </w:r>
           </w:p>
         </w:tc>
@@ -1344,16 +1527,10 @@
           </w:tcPr>
           <w:p>
             <w:pPr>
-              <w:spacing w:after="0" w:line="240" w:lineRule="auto"/>
-              <w:ind w:firstLine="0"/>
-              <w:jc w:val="left"/>
-            </w:pPr>
-            <w:r>
-              <w:rPr>
-                <w:rFonts w:ascii="Times New Roman" w:hAnsi="Times New Roman"/>
-                <w:sz w:val="24"/>
-              </w:rPr>
-              <w:t xml:space="preserve">Вартість покупки</w:t>
+              <w:spacing w:line="360" w:lineRule="auto"/>
+            </w:pPr>
+            <w:r>
+              <w:t>Вартість покупки</w:t>
             </w:r>
           </w:p>
         </w:tc>
@@ -1363,16 +1540,10 @@
           </w:tcPr>
           <w:p>
             <w:pPr>
-              <w:spacing w:after="0" w:line="240" w:lineRule="auto"/>
-              <w:ind w:firstLine="0"/>
-              <w:jc w:val="left"/>
-            </w:pPr>
-            <w:r>
-              <w:rPr>
-                <w:rFonts w:ascii="Times New Roman" w:hAnsi="Times New Roman"/>
-                <w:sz w:val="24"/>
-              </w:rPr>
-              <w:t xml:space="preserve">Ціна за одиницю, помножена на кількість, заокруглена до копійок</w:t>
+              <w:spacing w:line="360" w:lineRule="auto"/>
+            </w:pPr>
+            <w:r>
+              <w:t>Ціна за одиницю, помножена на кількість, заокруглена до копійок</w:t>
             </w:r>
           </w:p>
         </w:tc>
@@ -1384,16 +1555,10 @@
           </w:tcPr>
           <w:p>
             <w:pPr>
-              <w:spacing w:after="0" w:line="240" w:lineRule="auto"/>
-              <w:ind w:firstLine="0"/>
-              <w:jc w:val="left"/>
-            </w:pPr>
-            <w:r>
-              <w:rPr>
-                <w:rFonts w:ascii="Times New Roman" w:hAnsi="Times New Roman"/>
-                <w:sz w:val="24"/>
-              </w:rPr>
-              <w:t xml:space="preserve">Календарний тиждень</w:t>
+              <w:spacing w:line="360" w:lineRule="auto"/>
+            </w:pPr>
+            <w:r>
+              <w:t>Календарний тиждень</w:t>
             </w:r>
           </w:p>
         </w:tc>
@@ -1403,16 +1568,10 @@
           </w:tcPr>
           <w:p>
             <w:pPr>
-              <w:spacing w:after="0" w:line="240" w:lineRule="auto"/>
-              <w:ind w:firstLine="0"/>
-              <w:jc w:val="left"/>
-            </w:pPr>
-            <w:r>
-              <w:rPr>
-                <w:rFonts w:ascii="Times New Roman" w:hAnsi="Times New Roman"/>
-                <w:sz w:val="24"/>
-              </w:rPr>
-              <w:t xml:space="preserve">Період з понеділка по неділю включно</w:t>
+              <w:spacing w:line="360" w:lineRule="auto"/>
+            </w:pPr>
+            <w:r>
+              <w:t>Період з понеділка по неділю включно</w:t>
             </w:r>
           </w:p>
         </w:tc>
@@ -1424,16 +1583,10 @@
           </w:tcPr>
           <w:p>
             <w:pPr>
-              <w:spacing w:after="0" w:line="240" w:lineRule="auto"/>
-              <w:ind w:firstLine="0"/>
-              <w:jc w:val="left"/>
-            </w:pPr>
-            <w:r>
-              <w:rPr>
-                <w:rFonts w:ascii="Times New Roman" w:hAnsi="Times New Roman"/>
-                <w:sz w:val="24"/>
-              </w:rPr>
-              <w:t xml:space="preserve">Підсумок за період</w:t>
+              <w:spacing w:line="360" w:lineRule="auto"/>
+            </w:pPr>
+            <w:r>
+              <w:t>Підсумок за період</w:t>
             </w:r>
           </w:p>
         </w:tc>
@@ -1443,16 +1596,10 @@
           </w:tcPr>
           <w:p>
             <w:pPr>
-              <w:spacing w:after="0" w:line="240" w:lineRule="auto"/>
-              <w:ind w:firstLine="0"/>
-              <w:jc w:val="left"/>
-            </w:pPr>
-            <w:r>
-              <w:rPr>
-                <w:rFonts w:ascii="Times New Roman" w:hAnsi="Times New Roman"/>
-                <w:sz w:val="24"/>
-              </w:rPr>
-              <w:t xml:space="preserve">Сума вартостей усіх покупок профілю, дата яких належить періоду</w:t>
+              <w:spacing w:line="360" w:lineRule="auto"/>
+            </w:pPr>
+            <w:r>
+              <w:t>Сума вартостей усіх покупок профілю, дата яких належить періоду</w:t>
             </w:r>
           </w:p>
         </w:tc>
@@ -1465,7 +1612,7 @@
         <w:jc w:val="both"/>
       </w:pPr>
       <w:r>
-        <w:t xml:space="preserve">Окремо зафіксовано терміни, яких у проєкті уникають: «транзакція» і «витрата» замінено на «покупка», обліковий запис - на «профіль».</w:t>
+        <w:t>Окремо зафіксовано терміни, яких у проєкті уникають: «транзакція» і «витрата» замінено на «покупка», обліковий запис - на «профіль».</w:t>
       </w:r>
     </w:p>
     <w:p>
@@ -1485,7 +1632,7 @@
           <w:sz w:val="28"/>
           <w:szCs w:val="28"/>
         </w:rPr>
-        <w:t xml:space="preserve">7. Структура SRS</w:t>
+        <w:t>7. Структура SRS</w:t>
       </w:r>
     </w:p>
     <w:p>
@@ -1495,7 +1642,7 @@
         <w:jc w:val="both"/>
       </w:pPr>
       <w:r>
-        <w:t xml:space="preserve">Документ збережено у spec/srs.tex у форматі LaTeX, придатному до порівняння версій. Структура адаптована до навчального проєкту з урахуванням IEEE 830:</w:t>
+        <w:t>Документ збережено у spec/srs.tex у форматі LaTeX, придатному до порівняння версій. Структура адаптована до навчального проєкту з урахуванням IEEE 830:</w:t>
       </w:r>
     </w:p>
     <w:p>
@@ -1509,7 +1656,7 @@
         <w:jc w:val="both"/>
       </w:pPr>
       <w:r>
-        <w:t xml:space="preserve">вступ: призначення документа, область застосування, терміни, джерела вимог;</w:t>
+        <w:t>вступ: призначення документа, область застосування, терміни, джерела вимог;</w:t>
       </w:r>
     </w:p>
     <w:p>
@@ -1523,7 +1670,7 @@
         <w:jc w:val="both"/>
       </w:pPr>
       <w:r>
-        <w:t xml:space="preserve">загальний опис: призначення системи, користувачі, середовище виконання, припущення;</w:t>
+        <w:t>загальний опис: призначення системи, користувачі, середовище виконання, припущення;</w:t>
       </w:r>
     </w:p>
     <w:p>
@@ -1537,7 +1684,7 @@
         <w:jc w:val="both"/>
       </w:pPr>
       <w:r>
-        <w:t xml:space="preserve">межі системи: що входить, що не входить, зміни меж відносно задуму;</w:t>
+        <w:t>межі системи: що входить, що не входить, зміни меж відносно задуму;</w:t>
       </w:r>
     </w:p>
     <w:p>
@@ -1551,7 +1698,7 @@
         <w:jc w:val="both"/>
       </w:pPr>
       <w:r>
-        <w:t xml:space="preserve">функціональні вимоги (36): профілі, покупки, перевірка даних, категорії, підсумки й аналітика, зберігання та експорт;</w:t>
+        <w:t>функціональні вимоги (36): профілі, покупки, перевірка даних, категорії, підсумки й аналітика, зберігання та експорт;</w:t>
       </w:r>
     </w:p>
     <w:p>
@@ -1565,7 +1712,7 @@
         <w:jc w:val="both"/>
       </w:pPr>
       <w:r>
-        <w:t xml:space="preserve">нефункціональні вимоги (15): TDD, журналювання, якість роботи, обмеження реалізації;</w:t>
+        <w:t>нефункціональні вимоги (15): TDD, журналювання, якість роботи, обмеження реалізації;</w:t>
       </w:r>
     </w:p>
     <w:p>
@@ -1579,7 +1726,8 @@
         <w:jc w:val="both"/>
       </w:pPr>
       <w:r>
-        <w:t xml:space="preserve">вимоги до інтерфейсів (4), обмеження, критерії прийняття, BDD-сценарії, простежуваність, відкриті питання.</w:t>
+        <w:lastRenderedPageBreak/>
+        <w:t>вимоги до інтерфейсів (4), обмеження, критерії прийняття, BDD-сценарії, простежуваність, відкриті питання.</w:t>
       </w:r>
     </w:p>
     <w:p>
@@ -1599,7 +1747,7 @@
           <w:sz w:val="28"/>
           <w:szCs w:val="28"/>
         </w:rPr>
-        <w:t xml:space="preserve">8. Приклади функціональних вимог</w:t>
+        <w:t>8. Приклади функціональних вимог</w:t>
       </w:r>
     </w:p>
     <w:tbl>
@@ -1619,6 +1767,7 @@
           <w:bottom w:w="40" w:type="dxa"/>
           <w:right w:w="80" w:type="dxa"/>
         </w:tblCellMar>
+        <w:tblLook w:val="04A0" w:firstRow="1" w:lastRow="0" w:firstColumn="1" w:lastColumn="0" w:noHBand="0" w:noVBand="1"/>
       </w:tblPr>
       <w:tblGrid>
         <w:gridCol w:w="1400"/>
@@ -1628,42 +1777,34 @@
         <w:tc>
           <w:tcPr>
             <w:tcW w:w="1400" w:type="dxa"/>
-            <w:shd w:val="clear" w:fill="D9E2F3"/>
-          </w:tcPr>
-          <w:p>
-            <w:pPr>
-              <w:spacing w:after="0" w:line="240" w:lineRule="auto"/>
-              <w:ind w:firstLine="0"/>
-              <w:jc w:val="left"/>
+            <w:shd w:val="clear" w:color="auto" w:fill="auto"/>
+          </w:tcPr>
+          <w:p>
+            <w:pPr>
+              <w:spacing w:line="360" w:lineRule="auto"/>
             </w:pPr>
             <w:r>
               <w:rPr>
-                <w:rFonts w:ascii="Times New Roman" w:hAnsi="Times New Roman"/>
-                <w:sz w:val="24"/>
                 <w:b/>
               </w:rPr>
-              <w:t xml:space="preserve">ID</w:t>
+              <w:t>ID</w:t>
             </w:r>
           </w:p>
         </w:tc>
         <w:tc>
           <w:tcPr>
             <w:tcW w:w="7955" w:type="dxa"/>
-            <w:shd w:val="clear" w:fill="D9E2F3"/>
-          </w:tcPr>
-          <w:p>
-            <w:pPr>
-              <w:spacing w:after="0" w:line="240" w:lineRule="auto"/>
-              <w:ind w:firstLine="0"/>
-              <w:jc w:val="left"/>
+            <w:shd w:val="clear" w:color="auto" w:fill="auto"/>
+          </w:tcPr>
+          <w:p>
+            <w:pPr>
+              <w:spacing w:line="360" w:lineRule="auto"/>
             </w:pPr>
             <w:r>
               <w:rPr>
-                <w:rFonts w:ascii="Times New Roman" w:hAnsi="Times New Roman"/>
-                <w:sz w:val="24"/>
                 <w:b/>
               </w:rPr>
-              <w:t xml:space="preserve">Вимога</w:t>
+              <w:t>Вимога</w:t>
             </w:r>
           </w:p>
         </w:tc>
@@ -1675,16 +1816,10 @@
           </w:tcPr>
           <w:p>
             <w:pPr>
-              <w:spacing w:after="0" w:line="240" w:lineRule="auto"/>
-              <w:ind w:firstLine="0"/>
-              <w:jc w:val="left"/>
-            </w:pPr>
-            <w:r>
-              <w:rPr>
-                <w:rFonts w:ascii="Times New Roman" w:hAnsi="Times New Roman"/>
-                <w:sz w:val="24"/>
-              </w:rPr>
-              <w:t xml:space="preserve">REQ-F-003</w:t>
+              <w:spacing w:line="360" w:lineRule="auto"/>
+            </w:pPr>
+            <w:r>
+              <w:t>REQ-F-003</w:t>
             </w:r>
           </w:p>
         </w:tc>
@@ -1694,16 +1829,10 @@
           </w:tcPr>
           <w:p>
             <w:pPr>
-              <w:spacing w:after="0" w:line="240" w:lineRule="auto"/>
-              <w:ind w:firstLine="0"/>
-              <w:jc w:val="left"/>
-            </w:pPr>
-            <w:r>
-              <w:rPr>
-                <w:rFonts w:ascii="Times New Roman" w:hAnsi="Times New Roman"/>
-                <w:sz w:val="24"/>
-              </w:rPr>
-              <w:t xml:space="preserve">Система показує та змінює лише дані активного профілю: покупки і категорії інших профілів недоступні</w:t>
+              <w:spacing w:line="360" w:lineRule="auto"/>
+            </w:pPr>
+            <w:r>
+              <w:t>Система показує та змінює лише дані активного профілю: покупки і категорії інших профілів недоступні</w:t>
             </w:r>
           </w:p>
         </w:tc>
@@ -1715,16 +1844,10 @@
           </w:tcPr>
           <w:p>
             <w:pPr>
-              <w:spacing w:after="0" w:line="240" w:lineRule="auto"/>
-              <w:ind w:firstLine="0"/>
-              <w:jc w:val="left"/>
-            </w:pPr>
-            <w:r>
-              <w:rPr>
-                <w:rFonts w:ascii="Times New Roman" w:hAnsi="Times New Roman"/>
-                <w:sz w:val="24"/>
-              </w:rPr>
-              <w:t xml:space="preserve">REQ-F-006</w:t>
+              <w:spacing w:line="360" w:lineRule="auto"/>
+            </w:pPr>
+            <w:r>
+              <w:t>REQ-F-006</w:t>
             </w:r>
           </w:p>
         </w:tc>
@@ -1734,16 +1857,10 @@
           </w:tcPr>
           <w:p>
             <w:pPr>
-              <w:spacing w:after="0" w:line="240" w:lineRule="auto"/>
-              <w:ind w:firstLine="0"/>
-              <w:jc w:val="left"/>
-            </w:pPr>
-            <w:r>
-              <w:rPr>
-                <w:rFonts w:ascii="Times New Roman" w:hAnsi="Times New Roman"/>
-                <w:sz w:val="24"/>
-              </w:rPr>
-              <w:t xml:space="preserve">Система обчислює вартість покупки як добуток ціни за одиницю та кількості, заокруглений до двох знаків після коми</w:t>
+              <w:spacing w:line="360" w:lineRule="auto"/>
+            </w:pPr>
+            <w:r>
+              <w:t>Система обчислює вартість покупки як добуток ціни за одиницю та кількості, заокруглений до двох знаків після коми</w:t>
             </w:r>
           </w:p>
         </w:tc>
@@ -1755,16 +1872,10 @@
           </w:tcPr>
           <w:p>
             <w:pPr>
-              <w:spacing w:after="0" w:line="240" w:lineRule="auto"/>
-              <w:ind w:firstLine="0"/>
-              <w:jc w:val="left"/>
-            </w:pPr>
-            <w:r>
-              <w:rPr>
-                <w:rFonts w:ascii="Times New Roman" w:hAnsi="Times New Roman"/>
-                <w:sz w:val="24"/>
-              </w:rPr>
-              <w:t xml:space="preserve">REQ-F-016</w:t>
+              <w:spacing w:line="360" w:lineRule="auto"/>
+            </w:pPr>
+            <w:r>
+              <w:t>REQ-F-016</w:t>
             </w:r>
           </w:p>
         </w:tc>
@@ -1774,16 +1885,10 @@
           </w:tcPr>
           <w:p>
             <w:pPr>
-              <w:spacing w:after="0" w:line="240" w:lineRule="auto"/>
-              <w:ind w:firstLine="0"/>
-              <w:jc w:val="left"/>
-            </w:pPr>
-            <w:r>
-              <w:rPr>
-                <w:rFonts w:ascii="Times New Roman" w:hAnsi="Times New Roman"/>
-                <w:sz w:val="24"/>
-              </w:rPr>
-              <w:t xml:space="preserve">Система відхиляє покупку, дата й час якої пізніші за поточний момент</w:t>
+              <w:spacing w:line="360" w:lineRule="auto"/>
+            </w:pPr>
+            <w:r>
+              <w:t>Система відхиляє покупку, дата й час якої пізніші за поточний момент</w:t>
             </w:r>
           </w:p>
         </w:tc>
@@ -1795,16 +1900,10 @@
           </w:tcPr>
           <w:p>
             <w:pPr>
-              <w:spacing w:after="0" w:line="240" w:lineRule="auto"/>
-              <w:ind w:firstLine="0"/>
-              <w:jc w:val="left"/>
-            </w:pPr>
-            <w:r>
-              <w:rPr>
-                <w:rFonts w:ascii="Times New Roman" w:hAnsi="Times New Roman"/>
-                <w:sz w:val="24"/>
-              </w:rPr>
-              <w:t xml:space="preserve">REQ-F-024</w:t>
+              <w:spacing w:line="360" w:lineRule="auto"/>
+            </w:pPr>
+            <w:r>
+              <w:t>REQ-F-024</w:t>
             </w:r>
           </w:p>
         </w:tc>
@@ -1814,16 +1913,13 @@
           </w:tcPr>
           <w:p>
             <w:pPr>
-              <w:spacing w:after="0" w:line="240" w:lineRule="auto"/>
-              <w:ind w:firstLine="0"/>
-              <w:jc w:val="left"/>
-            </w:pPr>
-            <w:r>
-              <w:rPr>
-                <w:rFonts w:ascii="Times New Roman" w:hAnsi="Times New Roman"/>
-                <w:sz w:val="24"/>
-              </w:rPr>
-              <w:t xml:space="preserve">Якщо користувач підтверджує видалення непорожньої категорії, система переносить її покупки до службової категорії «Інше»</w:t>
+              <w:spacing w:line="360" w:lineRule="auto"/>
+            </w:pPr>
+            <w:r>
+              <w:t>Якщо користувач підтверджує видалення непорожньої к</w:t>
+            </w:r>
+            <w:r>
+              <w:t>атегорії, система переносить її покупки до службової категорії «Інше»</w:t>
             </w:r>
           </w:p>
         </w:tc>
@@ -1835,16 +1931,10 @@
           </w:tcPr>
           <w:p>
             <w:pPr>
-              <w:spacing w:after="0" w:line="240" w:lineRule="auto"/>
-              <w:ind w:firstLine="0"/>
-              <w:jc w:val="left"/>
-            </w:pPr>
-            <w:r>
-              <w:rPr>
-                <w:rFonts w:ascii="Times New Roman" w:hAnsi="Times New Roman"/>
-                <w:sz w:val="24"/>
-              </w:rPr>
-              <w:t xml:space="preserve">REQ-F-027</w:t>
+              <w:spacing w:line="360" w:lineRule="auto"/>
+            </w:pPr>
+            <w:r>
+              <w:t>REQ-F-027</w:t>
             </w:r>
           </w:p>
         </w:tc>
@@ -1854,16 +1944,10 @@
           </w:tcPr>
           <w:p>
             <w:pPr>
-              <w:spacing w:after="0" w:line="240" w:lineRule="auto"/>
-              <w:ind w:firstLine="0"/>
-              <w:jc w:val="left"/>
-            </w:pPr>
-            <w:r>
-              <w:rPr>
-                <w:rFonts w:ascii="Times New Roman" w:hAnsi="Times New Roman"/>
-                <w:sz w:val="24"/>
-              </w:rPr>
-              <w:t xml:space="preserve">Система обчислює підсумок витрат за календарний тиждень з понеділка по неділю</w:t>
+              <w:spacing w:line="360" w:lineRule="auto"/>
+            </w:pPr>
+            <w:r>
+              <w:t>Система обчислює підсумок витрат за календарний тиждень з понеділка по неділю</w:t>
             </w:r>
           </w:p>
         </w:tc>
@@ -1875,16 +1959,10 @@
           </w:tcPr>
           <w:p>
             <w:pPr>
-              <w:spacing w:after="0" w:line="240" w:lineRule="auto"/>
-              <w:ind w:firstLine="0"/>
-              <w:jc w:val="left"/>
-            </w:pPr>
-            <w:r>
-              <w:rPr>
-                <w:rFonts w:ascii="Times New Roman" w:hAnsi="Times New Roman"/>
-                <w:sz w:val="24"/>
-              </w:rPr>
-              <w:t xml:space="preserve">REQ-F-030</w:t>
+              <w:spacing w:line="360" w:lineRule="auto"/>
+            </w:pPr>
+            <w:r>
+              <w:t>REQ-F-030</w:t>
             </w:r>
           </w:p>
         </w:tc>
@@ -1894,16 +1972,13 @@
           </w:tcPr>
           <w:p>
             <w:pPr>
-              <w:spacing w:after="0" w:line="240" w:lineRule="auto"/>
-              <w:ind w:firstLine="0"/>
-              <w:jc w:val="left"/>
-            </w:pPr>
-            <w:r>
-              <w:rPr>
-                <w:rFonts w:ascii="Times New Roman" w:hAnsi="Times New Roman"/>
-                <w:sz w:val="24"/>
-              </w:rPr>
-              <w:t xml:space="preserve">Система відображає розбивку витрат за категоріями у вигляді таблиці «категорія - сума - частка у відсотках»</w:t>
+              <w:spacing w:line="360" w:lineRule="auto"/>
+            </w:pPr>
+            <w:r>
+              <w:t xml:space="preserve">Система відображає розбивку витрат за категоріями у вигляді таблиці «категорія - сума </w:t>
+            </w:r>
+            <w:r>
+              <w:t>- частка у відсотках»</w:t>
             </w:r>
           </w:p>
         </w:tc>
@@ -1926,7 +2001,7 @@
           <w:sz w:val="28"/>
           <w:szCs w:val="28"/>
         </w:rPr>
-        <w:t xml:space="preserve">9. Нефункціональні вимоги: TDD і журналювання</w:t>
+        <w:t>9. Нефункціональні вимоги: TDD і журналювання</w:t>
       </w:r>
     </w:p>
     <w:p>
@@ -1936,7 +2011,7 @@
         <w:jc w:val="both"/>
       </w:pPr>
       <w:r>
-        <w:t xml:space="preserve">Окремою групою винесено вимоги до процесу розробки, бо саме вони визначають, як перевірятиметься робота кодингового агента в наступних лабораторних роботах.</w:t>
+        <w:t>Окремою групою винесено вимоги до процесу розробки, бо саме вони визначають, як перевірятиметься робота кодингового агента в наступних лабораторних роботах.</w:t>
       </w:r>
     </w:p>
     <w:tbl>
@@ -1956,6 +2031,7 @@
           <w:bottom w:w="40" w:type="dxa"/>
           <w:right w:w="80" w:type="dxa"/>
         </w:tblCellMar>
+        <w:tblLook w:val="04A0" w:firstRow="1" w:lastRow="0" w:firstColumn="1" w:lastColumn="0" w:noHBand="0" w:noVBand="1"/>
       </w:tblPr>
       <w:tblGrid>
         <w:gridCol w:w="1600"/>
@@ -1965,42 +2041,34 @@
         <w:tc>
           <w:tcPr>
             <w:tcW w:w="1600" w:type="dxa"/>
-            <w:shd w:val="clear" w:fill="D9E2F3"/>
-          </w:tcPr>
-          <w:p>
-            <w:pPr>
-              <w:spacing w:after="0" w:line="240" w:lineRule="auto"/>
-              <w:ind w:firstLine="0"/>
-              <w:jc w:val="left"/>
+            <w:shd w:val="clear" w:color="auto" w:fill="auto"/>
+          </w:tcPr>
+          <w:p>
+            <w:pPr>
+              <w:spacing w:line="360" w:lineRule="auto"/>
             </w:pPr>
             <w:r>
               <w:rPr>
-                <w:rFonts w:ascii="Times New Roman" w:hAnsi="Times New Roman"/>
-                <w:sz w:val="24"/>
                 <w:b/>
               </w:rPr>
-              <w:t xml:space="preserve">ID</w:t>
+              <w:t>ID</w:t>
             </w:r>
           </w:p>
         </w:tc>
         <w:tc>
           <w:tcPr>
             <w:tcW w:w="7755" w:type="dxa"/>
-            <w:shd w:val="clear" w:fill="D9E2F3"/>
-          </w:tcPr>
-          <w:p>
-            <w:pPr>
-              <w:spacing w:after="0" w:line="240" w:lineRule="auto"/>
-              <w:ind w:firstLine="0"/>
-              <w:jc w:val="left"/>
+            <w:shd w:val="clear" w:color="auto" w:fill="auto"/>
+          </w:tcPr>
+          <w:p>
+            <w:pPr>
+              <w:spacing w:line="360" w:lineRule="auto"/>
             </w:pPr>
             <w:r>
               <w:rPr>
-                <w:rFonts w:ascii="Times New Roman" w:hAnsi="Times New Roman"/>
-                <w:sz w:val="24"/>
                 <w:b/>
               </w:rPr>
-              <w:t xml:space="preserve">Вимога</w:t>
+              <w:t>Вимога</w:t>
             </w:r>
           </w:p>
         </w:tc>
@@ -2012,16 +2080,10 @@
           </w:tcPr>
           <w:p>
             <w:pPr>
-              <w:spacing w:after="0" w:line="240" w:lineRule="auto"/>
-              <w:ind w:firstLine="0"/>
-              <w:jc w:val="left"/>
-            </w:pPr>
-            <w:r>
-              <w:rPr>
-                <w:rFonts w:ascii="Times New Roman" w:hAnsi="Times New Roman"/>
-                <w:sz w:val="24"/>
-              </w:rPr>
-              <w:t xml:space="preserve">REQ-NF-001</w:t>
+              <w:spacing w:line="360" w:lineRule="auto"/>
+            </w:pPr>
+            <w:r>
+              <w:t>REQ-NF-001</w:t>
             </w:r>
           </w:p>
         </w:tc>
@@ -2031,16 +2093,13 @@
           </w:tcPr>
           <w:p>
             <w:pPr>
-              <w:spacing w:after="0" w:line="240" w:lineRule="auto"/>
-              <w:ind w:firstLine="0"/>
-              <w:jc w:val="left"/>
-            </w:pPr>
-            <w:r>
-              <w:rPr>
-                <w:rFonts w:ascii="Times New Roman" w:hAnsi="Times New Roman"/>
-                <w:sz w:val="24"/>
-              </w:rPr>
-              <w:t xml:space="preserve">Розробка ведеться за TDD: для кожної функціональної вимоги спочатку створюється тест, який не проходить, і лише після цього пишеться код</w:t>
+              <w:spacing w:line="360" w:lineRule="auto"/>
+            </w:pPr>
+            <w:r>
+              <w:t>Розробка ведеться за TDD: для кожної функціональної вимоги спочатку створюєть</w:t>
+            </w:r>
+            <w:r>
+              <w:t>ся тест, який не проходить, і лише після цього пишеться код</w:t>
             </w:r>
           </w:p>
         </w:tc>
@@ -2052,16 +2111,10 @@
           </w:tcPr>
           <w:p>
             <w:pPr>
-              <w:spacing w:after="0" w:line="240" w:lineRule="auto"/>
-              <w:ind w:firstLine="0"/>
-              <w:jc w:val="left"/>
-            </w:pPr>
-            <w:r>
-              <w:rPr>
-                <w:rFonts w:ascii="Times New Roman" w:hAnsi="Times New Roman"/>
-                <w:sz w:val="24"/>
-              </w:rPr>
-              <w:t xml:space="preserve">REQ-NF-002</w:t>
+              <w:spacing w:line="360" w:lineRule="auto"/>
+            </w:pPr>
+            <w:r>
+              <w:t>REQ-NF-002</w:t>
             </w:r>
           </w:p>
         </w:tc>
@@ -2071,16 +2124,10 @@
           </w:tcPr>
           <w:p>
             <w:pPr>
-              <w:spacing w:after="0" w:line="240" w:lineRule="auto"/>
-              <w:ind w:firstLine="0"/>
-              <w:jc w:val="left"/>
-            </w:pPr>
-            <w:r>
-              <w:rPr>
-                <w:rFonts w:ascii="Times New Roman" w:hAnsi="Times New Roman"/>
-                <w:sz w:val="24"/>
-              </w:rPr>
-              <w:t xml:space="preserve">Кожна вимога REQ-F-XXX покрита щонайменше одним тестом; ідентифікатор вимоги зазначається в назві тесту</w:t>
+              <w:spacing w:line="360" w:lineRule="auto"/>
+            </w:pPr>
+            <w:r>
+              <w:t>Кожна вимога REQ-F-XXX покрита щонайменше одним тестом; ідентифікатор вимоги зазначається в назві тесту</w:t>
             </w:r>
           </w:p>
         </w:tc>
@@ -2092,16 +2139,11 @@
           </w:tcPr>
           <w:p>
             <w:pPr>
-              <w:spacing w:after="0" w:line="240" w:lineRule="auto"/>
-              <w:ind w:firstLine="0"/>
-              <w:jc w:val="left"/>
-            </w:pPr>
-            <w:r>
-              <w:rPr>
-                <w:rFonts w:ascii="Times New Roman" w:hAnsi="Times New Roman"/>
-                <w:sz w:val="24"/>
-              </w:rPr>
-              <w:t xml:space="preserve">REQ-NF-003</w:t>
+              <w:spacing w:line="360" w:lineRule="auto"/>
+            </w:pPr>
+            <w:r>
+              <w:lastRenderedPageBreak/>
+              <w:t>REQ-NF-003</w:t>
             </w:r>
           </w:p>
         </w:tc>
@@ -2111,16 +2153,10 @@
           </w:tcPr>
           <w:p>
             <w:pPr>
-              <w:spacing w:after="0" w:line="240" w:lineRule="auto"/>
-              <w:ind w:firstLine="0"/>
-              <w:jc w:val="left"/>
-            </w:pPr>
-            <w:r>
-              <w:rPr>
-                <w:rFonts w:ascii="Times New Roman" w:hAnsi="Times New Roman"/>
-                <w:sz w:val="24"/>
-              </w:rPr>
-              <w:t xml:space="preserve">Повний набір тестів запускається однією командою і завершується без помилок перед кожним комітом feat:</w:t>
+              <w:spacing w:line="360" w:lineRule="auto"/>
+            </w:pPr>
+            <w:r>
+              <w:t>Повний набір тестів запускається однією командою і завершується без помилок перед кожним комітом feat:</w:t>
             </w:r>
           </w:p>
         </w:tc>
@@ -2132,16 +2168,10 @@
           </w:tcPr>
           <w:p>
             <w:pPr>
-              <w:spacing w:after="0" w:line="240" w:lineRule="auto"/>
-              <w:ind w:firstLine="0"/>
-              <w:jc w:val="left"/>
-            </w:pPr>
-            <w:r>
-              <w:rPr>
-                <w:rFonts w:ascii="Times New Roman" w:hAnsi="Times New Roman"/>
-                <w:sz w:val="24"/>
-              </w:rPr>
-              <w:t xml:space="preserve">REQ-NF-004</w:t>
+              <w:spacing w:line="360" w:lineRule="auto"/>
+            </w:pPr>
+            <w:r>
+              <w:t>REQ-NF-004</w:t>
             </w:r>
           </w:p>
         </w:tc>
@@ -2151,16 +2181,13 @@
           </w:tcPr>
           <w:p>
             <w:pPr>
-              <w:spacing w:after="0" w:line="240" w:lineRule="auto"/>
-              <w:ind w:firstLine="0"/>
-              <w:jc w:val="left"/>
-            </w:pPr>
-            <w:r>
-              <w:rPr>
-                <w:rFonts w:ascii="Times New Roman" w:hAnsi="Times New Roman"/>
-                <w:sz w:val="24"/>
-              </w:rPr>
-              <w:t xml:space="preserve">В історії Git коміт test: для вимоги передує коміту feat: для тієї самої вимоги</w:t>
+              <w:spacing w:line="360" w:lineRule="auto"/>
+            </w:pPr>
+            <w:r>
+              <w:t>В історії Git коміт test:</w:t>
+            </w:r>
+            <w:r>
+              <w:t xml:space="preserve"> для вимоги передує коміту feat: для тієї самої вимоги</w:t>
             </w:r>
           </w:p>
         </w:tc>
@@ -2172,16 +2199,10 @@
           </w:tcPr>
           <w:p>
             <w:pPr>
-              <w:spacing w:after="0" w:line="240" w:lineRule="auto"/>
-              <w:ind w:firstLine="0"/>
-              <w:jc w:val="left"/>
-            </w:pPr>
-            <w:r>
-              <w:rPr>
-                <w:rFonts w:ascii="Times New Roman" w:hAnsi="Times New Roman"/>
-                <w:sz w:val="24"/>
-              </w:rPr>
-              <w:t xml:space="preserve">REQ-NF-005</w:t>
+              <w:spacing w:line="360" w:lineRule="auto"/>
+            </w:pPr>
+            <w:r>
+              <w:t>REQ-NF-005</w:t>
             </w:r>
           </w:p>
         </w:tc>
@@ -2191,16 +2212,10 @@
           </w:tcPr>
           <w:p>
             <w:pPr>
-              <w:spacing w:after="0" w:line="240" w:lineRule="auto"/>
-              <w:ind w:firstLine="0"/>
-              <w:jc w:val="left"/>
-            </w:pPr>
-            <w:r>
-              <w:rPr>
-                <w:rFonts w:ascii="Times New Roman" w:hAnsi="Times New Roman"/>
-                <w:sz w:val="24"/>
-              </w:rPr>
-              <w:t xml:space="preserve">Результат кожного прогону тестів записується у файл журналу в /logs: дата, кількість тестів, успішних і неуспішних</w:t>
+              <w:spacing w:line="360" w:lineRule="auto"/>
+            </w:pPr>
+            <w:r>
+              <w:t>Результат кожного прогону тестів записується у файл журналу в /logs: дата, кількість тестів, успішних і неуспішних</w:t>
             </w:r>
           </w:p>
         </w:tc>
@@ -2212,16 +2227,10 @@
           </w:tcPr>
           <w:p>
             <w:pPr>
-              <w:spacing w:after="0" w:line="240" w:lineRule="auto"/>
-              <w:ind w:firstLine="0"/>
-              <w:jc w:val="left"/>
-            </w:pPr>
-            <w:r>
-              <w:rPr>
-                <w:rFonts w:ascii="Times New Roman" w:hAnsi="Times New Roman"/>
-                <w:sz w:val="24"/>
-              </w:rPr>
-              <w:t xml:space="preserve">REQ-NF-006</w:t>
+              <w:spacing w:line="360" w:lineRule="auto"/>
+            </w:pPr>
+            <w:r>
+              <w:t>REQ-NF-006</w:t>
             </w:r>
           </w:p>
         </w:tc>
@@ -2231,16 +2240,13 @@
           </w:tcPr>
           <w:p>
             <w:pPr>
-              <w:spacing w:after="0" w:line="240" w:lineRule="auto"/>
-              <w:ind w:firstLine="0"/>
-              <w:jc w:val="left"/>
-            </w:pPr>
-            <w:r>
-              <w:rPr>
-                <w:rFonts w:ascii="Times New Roman" w:hAnsi="Times New Roman"/>
-                <w:sz w:val="24"/>
-              </w:rPr>
-              <w:t xml:space="preserve">Кожна сесія роботи з агентом фіксується у /logs: запит, змінені файли, результат перегляду git diff, рішення людини</w:t>
+              <w:spacing w:line="360" w:lineRule="auto"/>
+            </w:pPr>
+            <w:r>
+              <w:t>Кожна сесія роботи з агентом фіксується у /logs: запит, змінен</w:t>
+            </w:r>
+            <w:r>
+              <w:t>і файли, результат перегляду git diff, рішення людини</w:t>
             </w:r>
           </w:p>
         </w:tc>
@@ -2252,16 +2258,10 @@
           </w:tcPr>
           <w:p>
             <w:pPr>
-              <w:spacing w:after="0" w:line="240" w:lineRule="auto"/>
-              <w:ind w:firstLine="0"/>
-              <w:jc w:val="left"/>
-            </w:pPr>
-            <w:r>
-              <w:rPr>
-                <w:rFonts w:ascii="Times New Roman" w:hAnsi="Times New Roman"/>
-                <w:sz w:val="24"/>
-              </w:rPr>
-              <w:t xml:space="preserve">REQ-NF-007</w:t>
+              <w:spacing w:line="360" w:lineRule="auto"/>
+            </w:pPr>
+            <w:r>
+              <w:t>REQ-NF-007</w:t>
             </w:r>
           </w:p>
         </w:tc>
@@ -2271,16 +2271,10 @@
           </w:tcPr>
           <w:p>
             <w:pPr>
-              <w:spacing w:after="0" w:line="240" w:lineRule="auto"/>
-              <w:ind w:firstLine="0"/>
-              <w:jc w:val="left"/>
-            </w:pPr>
-            <w:r>
-              <w:rPr>
-                <w:rFonts w:ascii="Times New Roman" w:hAnsi="Times New Roman"/>
-                <w:sz w:val="24"/>
-              </w:rPr>
-              <w:t xml:space="preserve">Зміни агента не додаються до репозиторію без перегляду людиною; коміт містить позначку [agent]</w:t>
+              <w:spacing w:line="360" w:lineRule="auto"/>
+            </w:pPr>
+            <w:r>
+              <w:t>Зміни агента не додаються до репозиторію без перегляду людиною; коміт містить позначку [agent]</w:t>
             </w:r>
           </w:p>
         </w:tc>
@@ -2292,16 +2286,10 @@
           </w:tcPr>
           <w:p>
             <w:pPr>
-              <w:spacing w:after="0" w:line="240" w:lineRule="auto"/>
-              <w:ind w:firstLine="0"/>
-              <w:jc w:val="left"/>
-            </w:pPr>
-            <w:r>
-              <w:rPr>
-                <w:rFonts w:ascii="Times New Roman" w:hAnsi="Times New Roman"/>
-                <w:sz w:val="24"/>
-              </w:rPr>
-              <w:t xml:space="preserve">REQ-NF-008</w:t>
+              <w:spacing w:line="360" w:lineRule="auto"/>
+            </w:pPr>
+            <w:r>
+              <w:t>REQ-NF-008</w:t>
             </w:r>
           </w:p>
         </w:tc>
@@ -2311,16 +2299,13 @@
           </w:tcPr>
           <w:p>
             <w:pPr>
-              <w:spacing w:after="0" w:line="240" w:lineRule="auto"/>
-              <w:ind w:firstLine="0"/>
-              <w:jc w:val="left"/>
-            </w:pPr>
-            <w:r>
-              <w:rPr>
-                <w:rFonts w:ascii="Times New Roman" w:hAnsi="Times New Roman"/>
-                <w:sz w:val="24"/>
-              </w:rPr>
-              <w:t xml:space="preserve">Помилки виконання застосунку записуються у файл журналу в /logs із датою, часом і текстом помилки</w:t>
+              <w:spacing w:line="360" w:lineRule="auto"/>
+            </w:pPr>
+            <w:r>
+              <w:t>Помилки виконання застосунку записуються у файл журналу в /logs із датою, часом і т</w:t>
+            </w:r>
+            <w:r>
+              <w:t>екстом помилки</w:t>
             </w:r>
           </w:p>
         </w:tc>
@@ -2343,7 +2328,7 @@
           <w:sz w:val="28"/>
           <w:szCs w:val="28"/>
         </w:rPr>
-        <w:t xml:space="preserve">10. Приклади критеріїв прийняття</w:t>
+        <w:t>10. Приклади критеріїв прийняття</w:t>
       </w:r>
     </w:p>
     <w:tbl>
@@ -2363,6 +2348,7 @@
           <w:bottom w:w="40" w:type="dxa"/>
           <w:right w:w="80" w:type="dxa"/>
         </w:tblCellMar>
+        <w:tblLook w:val="04A0" w:firstRow="1" w:lastRow="0" w:firstColumn="1" w:lastColumn="0" w:noHBand="0" w:noVBand="1"/>
       </w:tblPr>
       <w:tblGrid>
         <w:gridCol w:w="1600"/>
@@ -2372,42 +2358,34 @@
         <w:tc>
           <w:tcPr>
             <w:tcW w:w="1600" w:type="dxa"/>
-            <w:shd w:val="clear" w:fill="D9E2F3"/>
-          </w:tcPr>
-          <w:p>
-            <w:pPr>
-              <w:spacing w:after="0" w:line="240" w:lineRule="auto"/>
-              <w:ind w:firstLine="0"/>
-              <w:jc w:val="left"/>
+            <w:shd w:val="clear" w:color="auto" w:fill="auto"/>
+          </w:tcPr>
+          <w:p>
+            <w:pPr>
+              <w:spacing w:line="360" w:lineRule="auto"/>
             </w:pPr>
             <w:r>
               <w:rPr>
-                <w:rFonts w:ascii="Times New Roman" w:hAnsi="Times New Roman"/>
-                <w:sz w:val="24"/>
                 <w:b/>
               </w:rPr>
-              <w:t xml:space="preserve">Вимога</w:t>
+              <w:t>Вимога</w:t>
             </w:r>
           </w:p>
         </w:tc>
         <w:tc>
           <w:tcPr>
             <w:tcW w:w="7755" w:type="dxa"/>
-            <w:shd w:val="clear" w:fill="D9E2F3"/>
-          </w:tcPr>
-          <w:p>
-            <w:pPr>
-              <w:spacing w:after="0" w:line="240" w:lineRule="auto"/>
-              <w:ind w:firstLine="0"/>
-              <w:jc w:val="left"/>
+            <w:shd w:val="clear" w:color="auto" w:fill="auto"/>
+          </w:tcPr>
+          <w:p>
+            <w:pPr>
+              <w:spacing w:line="360" w:lineRule="auto"/>
             </w:pPr>
             <w:r>
               <w:rPr>
-                <w:rFonts w:ascii="Times New Roman" w:hAnsi="Times New Roman"/>
-                <w:sz w:val="24"/>
                 <w:b/>
               </w:rPr>
-              <w:t xml:space="preserve">Критерій</w:t>
+              <w:t>Критерій</w:t>
             </w:r>
           </w:p>
         </w:tc>
@@ -2419,16 +2397,10 @@
           </w:tcPr>
           <w:p>
             <w:pPr>
-              <w:spacing w:after="0" w:line="240" w:lineRule="auto"/>
-              <w:ind w:firstLine="0"/>
-              <w:jc w:val="left"/>
-            </w:pPr>
-            <w:r>
-              <w:rPr>
-                <w:rFonts w:ascii="Times New Roman" w:hAnsi="Times New Roman"/>
-                <w:sz w:val="24"/>
-              </w:rPr>
-              <w:t xml:space="preserve">REQ-F-006</w:t>
+              <w:spacing w:line="360" w:lineRule="auto"/>
+            </w:pPr>
+            <w:r>
+              <w:t>REQ-F-006</w:t>
             </w:r>
           </w:p>
         </w:tc>
@@ -2438,16 +2410,10 @@
           </w:tcPr>
           <w:p>
             <w:pPr>
-              <w:spacing w:after="0" w:line="240" w:lineRule="auto"/>
-              <w:ind w:firstLine="0"/>
-              <w:jc w:val="left"/>
-            </w:pPr>
-            <w:r>
-              <w:rPr>
-                <w:rFonts w:ascii="Times New Roman" w:hAnsi="Times New Roman"/>
-                <w:sz w:val="24"/>
-              </w:rPr>
-              <w:t xml:space="preserve">Для ціни 80,00 грн за кілограм і кількості 0,7 вартість покупки дорівнює 56,00 грн</w:t>
+              <w:spacing w:line="360" w:lineRule="auto"/>
+            </w:pPr>
+            <w:r>
+              <w:t>Для ціни 80,00 грн за кілограм і кількості 0,7 вартість покупки дорівнює 56,00 грн</w:t>
             </w:r>
           </w:p>
         </w:tc>
@@ -2459,16 +2425,10 @@
           </w:tcPr>
           <w:p>
             <w:pPr>
-              <w:spacing w:after="0" w:line="240" w:lineRule="auto"/>
-              <w:ind w:firstLine="0"/>
-              <w:jc w:val="left"/>
-            </w:pPr>
-            <w:r>
-              <w:rPr>
-                <w:rFonts w:ascii="Times New Roman" w:hAnsi="Times New Roman"/>
-                <w:sz w:val="24"/>
-              </w:rPr>
-              <w:t xml:space="preserve">REQ-F-013</w:t>
+              <w:spacing w:line="360" w:lineRule="auto"/>
+            </w:pPr>
+            <w:r>
+              <w:t>REQ-F-013</w:t>
             </w:r>
           </w:p>
         </w:tc>
@@ -2478,16 +2438,10 @@
           </w:tcPr>
           <w:p>
             <w:pPr>
-              <w:spacing w:after="0" w:line="240" w:lineRule="auto"/>
-              <w:ind w:firstLine="0"/>
-              <w:jc w:val="left"/>
-            </w:pPr>
-            <w:r>
-              <w:rPr>
-                <w:rFonts w:ascii="Times New Roman" w:hAnsi="Times New Roman"/>
-                <w:sz w:val="24"/>
-              </w:rPr>
-              <w:t xml:space="preserve">При спробі додати покупку з ціною 0 або -50 запис не створюється, показується повідомлення про помилку</w:t>
+              <w:spacing w:line="360" w:lineRule="auto"/>
+            </w:pPr>
+            <w:r>
+              <w:t>При спробі додати покупку з ціною 0 або -50 запис не створюється, показується повідомлення про помилку</w:t>
             </w:r>
           </w:p>
         </w:tc>
@@ -2499,16 +2453,10 @@
           </w:tcPr>
           <w:p>
             <w:pPr>
-              <w:spacing w:after="0" w:line="240" w:lineRule="auto"/>
-              <w:ind w:firstLine="0"/>
-              <w:jc w:val="left"/>
-            </w:pPr>
-            <w:r>
-              <w:rPr>
-                <w:rFonts w:ascii="Times New Roman" w:hAnsi="Times New Roman"/>
-                <w:sz w:val="24"/>
-              </w:rPr>
-              <w:t xml:space="preserve">REQ-F-027</w:t>
+              <w:spacing w:line="360" w:lineRule="auto"/>
+            </w:pPr>
+            <w:r>
+              <w:t>REQ-F-027</w:t>
             </w:r>
           </w:p>
         </w:tc>
@@ -2518,16 +2466,10 @@
           </w:tcPr>
           <w:p>
             <w:pPr>
-              <w:spacing w:after="0" w:line="240" w:lineRule="auto"/>
-              <w:ind w:firstLine="0"/>
-              <w:jc w:val="left"/>
-            </w:pPr>
-            <w:r>
-              <w:rPr>
-                <w:rFonts w:ascii="Times New Roman" w:hAnsi="Times New Roman"/>
-                <w:sz w:val="24"/>
-              </w:rPr>
-              <w:t xml:space="preserve">Для покупок 100,00 грн у понеділок і 50,00 грн у неділю того самого тижня підсумок дорівнює 150,00 грн</w:t>
+              <w:spacing w:line="360" w:lineRule="auto"/>
+            </w:pPr>
+            <w:r>
+              <w:t>Для покупок 100,00 грн у понеділок і 50,00 грн у неділю того самого тижня підсумок дорівнює 150,00 грн</w:t>
             </w:r>
           </w:p>
         </w:tc>
@@ -2539,16 +2481,10 @@
           </w:tcPr>
           <w:p>
             <w:pPr>
-              <w:spacing w:after="0" w:line="240" w:lineRule="auto"/>
-              <w:ind w:firstLine="0"/>
-              <w:jc w:val="left"/>
-            </w:pPr>
-            <w:r>
-              <w:rPr>
-                <w:rFonts w:ascii="Times New Roman" w:hAnsi="Times New Roman"/>
-                <w:sz w:val="24"/>
-              </w:rPr>
-              <w:t xml:space="preserve">REQ-NF-001</w:t>
+              <w:spacing w:line="360" w:lineRule="auto"/>
+            </w:pPr>
+            <w:r>
+              <w:t>REQ-NF-001</w:t>
             </w:r>
           </w:p>
         </w:tc>
@@ -2558,16 +2494,13 @@
           </w:tcPr>
           <w:p>
             <w:pPr>
-              <w:spacing w:after="0" w:line="240" w:lineRule="auto"/>
-              <w:ind w:firstLine="0"/>
-              <w:jc w:val="left"/>
-            </w:pPr>
-            <w:r>
-              <w:rPr>
-                <w:rFonts w:ascii="Times New Roman" w:hAnsi="Times New Roman"/>
-                <w:sz w:val="24"/>
-              </w:rPr>
-              <w:t xml:space="preserve">Для кожної реалізованої вимоги в історії Git наявний коміт test:, датований раніше за коміт feat:</w:t>
+              <w:spacing w:line="360" w:lineRule="auto"/>
+            </w:pPr>
+            <w:r>
+              <w:t>Для кожної реалізованої вим</w:t>
+            </w:r>
+            <w:r>
+              <w:t>оги в історії Git наявний коміт test:, датований раніше за коміт feat:</w:t>
             </w:r>
           </w:p>
         </w:tc>
@@ -2579,16 +2512,10 @@
           </w:tcPr>
           <w:p>
             <w:pPr>
-              <w:spacing w:after="0" w:line="240" w:lineRule="auto"/>
-              <w:ind w:firstLine="0"/>
-              <w:jc w:val="left"/>
-            </w:pPr>
-            <w:r>
-              <w:rPr>
-                <w:rFonts w:ascii="Times New Roman" w:hAnsi="Times New Roman"/>
-                <w:sz w:val="24"/>
-              </w:rPr>
-              <w:t xml:space="preserve">REQ-NF-005</w:t>
+              <w:spacing w:line="360" w:lineRule="auto"/>
+            </w:pPr>
+            <w:r>
+              <w:t>REQ-NF-005</w:t>
             </w:r>
           </w:p>
         </w:tc>
@@ -2598,16 +2525,10 @@
           </w:tcPr>
           <w:p>
             <w:pPr>
-              <w:spacing w:after="0" w:line="240" w:lineRule="auto"/>
-              <w:ind w:firstLine="0"/>
-              <w:jc w:val="left"/>
-            </w:pPr>
-            <w:r>
-              <w:rPr>
-                <w:rFonts w:ascii="Times New Roman" w:hAnsi="Times New Roman"/>
-                <w:sz w:val="24"/>
-              </w:rPr>
-              <w:t xml:space="preserve">Після прогону тестів у /logs існує файл із датою і рядком «усього N, успішних M, неуспішних K»</w:t>
+              <w:spacing w:line="360" w:lineRule="auto"/>
+            </w:pPr>
+            <w:r>
+              <w:t>Після прогону тестів у /logs існує файл із датою і рядком «усього N, успішних M, неуспішних K»</w:t>
             </w:r>
           </w:p>
         </w:tc>
@@ -2619,16 +2540,10 @@
           </w:tcPr>
           <w:p>
             <w:pPr>
-              <w:spacing w:after="0" w:line="240" w:lineRule="auto"/>
-              <w:ind w:firstLine="0"/>
-              <w:jc w:val="left"/>
-            </w:pPr>
-            <w:r>
-              <w:rPr>
-                <w:rFonts w:ascii="Times New Roman" w:hAnsi="Times New Roman"/>
-                <w:sz w:val="24"/>
-              </w:rPr>
-              <w:t xml:space="preserve">REQ-NF-010</w:t>
+              <w:spacing w:line="360" w:lineRule="auto"/>
+            </w:pPr>
+            <w:r>
+              <w:t>REQ-NF-010</w:t>
             </w:r>
           </w:p>
         </w:tc>
@@ -2638,16 +2553,13 @@
           </w:tcPr>
           <w:p>
             <w:pPr>
-              <w:spacing w:after="0" w:line="240" w:lineRule="auto"/>
-              <w:ind w:firstLine="0"/>
-              <w:jc w:val="left"/>
-            </w:pPr>
-            <w:r>
-              <w:rPr>
-                <w:rFonts w:ascii="Times New Roman" w:hAnsi="Times New Roman"/>
-                <w:sz w:val="24"/>
-              </w:rPr>
-              <w:t xml:space="preserve">Для ціни 33,33 грн і кількості 3 вартість дорівнює 99,99 грн, а не 100,00 грн</w:t>
+              <w:spacing w:line="360" w:lineRule="auto"/>
+            </w:pPr>
+            <w:r>
+              <w:t>Для ціни 33,33 грн і кількості 3 вартість дорівнює 99,99 грн, а не</w:t>
+            </w:r>
+            <w:r>
+              <w:t xml:space="preserve"> 100,00 грн</w:t>
             </w:r>
           </w:p>
         </w:tc>
@@ -2670,7 +2582,8 @@
           <w:sz w:val="28"/>
           <w:szCs w:val="28"/>
         </w:rPr>
-        <w:t xml:space="preserve">11. Фрагмент BDD-сценаріїв</w:t>
+        <w:lastRenderedPageBreak/>
+        <w:t>11. Фрагмент BDD-сценаріїв</w:t>
       </w:r>
     </w:p>
     <w:p>
@@ -2680,13 +2593,12 @@
         <w:jc w:val="both"/>
       </w:pPr>
       <w:r>
-        <w:t xml:space="preserve">Сценарії зберігаються у spec/scenarios/expenses.feature; у назві кожного вказано ідентифікатор вимоги. Усього 14 сценаріїв: основні потоки і граничні випадки.</w:t>
+        <w:t>Сценарії зберігаються у spec/scenarios/expenses.feature; у назві кожного вказано ідентифікатор вимоги. Усього 14 сценаріїв: основні потоки і граничні випадки.</w:t>
       </w:r>
     </w:p>
     <w:p>
       <w:pPr>
         <w:keepLines/>
-        <w:shd w:val="clear" w:color="auto" w:fill="F2F2F2"/>
         <w:spacing w:before="80" w:line="360" w:lineRule="auto"/>
         <w:jc w:val="both"/>
       </w:pPr>
@@ -2694,13 +2606,12 @@
         <w:rPr>
           <w:rFonts w:eastAsia="Consolas"/>
         </w:rPr>
-        <w:t xml:space="preserve">Сценарій: Додавання покупки з кількістю (REQ-F-005, REQ-F-006, REQ-F-007)</w:t>
+        <w:t>Сценарій: Додавання покупки з кількістю (REQ-F-005, REQ-F-006, REQ-F-007)</w:t>
       </w:r>
     </w:p>
     <w:p>
       <w:pPr>
         <w:keepLines/>
-        <w:shd w:val="clear" w:color="auto" w:fill="F2F2F2"/>
         <w:spacing w:before="80" w:line="360" w:lineRule="auto"/>
         <w:jc w:val="both"/>
       </w:pPr>
@@ -2714,7 +2625,6 @@
     <w:p>
       <w:pPr>
         <w:keepLines/>
-        <w:shd w:val="clear" w:color="auto" w:fill="F2F2F2"/>
         <w:spacing w:before="80" w:line="360" w:lineRule="auto"/>
         <w:jc w:val="both"/>
       </w:pPr>
@@ -2728,7 +2638,6 @@
     <w:p>
       <w:pPr>
         <w:keepLines/>
-        <w:shd w:val="clear" w:color="auto" w:fill="F2F2F2"/>
         <w:spacing w:before="80" w:line="360" w:lineRule="auto"/>
         <w:jc w:val="both"/>
       </w:pPr>
@@ -2742,7 +2651,6 @@
     <w:p>
       <w:pPr>
         <w:keepLines/>
-        <w:shd w:val="clear" w:color="auto" w:fill="F2F2F2"/>
         <w:spacing w:before="80" w:line="360" w:lineRule="auto"/>
         <w:jc w:val="both"/>
       </w:pPr>
@@ -2756,7 +2664,6 @@
     <w:p>
       <w:pPr>
         <w:keepLines/>
-        <w:shd w:val="clear" w:color="auto" w:fill="F2F2F2"/>
         <w:spacing w:before="80" w:line="360" w:lineRule="auto"/>
         <w:jc w:val="both"/>
       </w:pPr>
@@ -2770,7 +2677,6 @@
     <w:p>
       <w:pPr>
         <w:keepLines/>
-        <w:shd w:val="clear" w:color="auto" w:fill="F2F2F2"/>
         <w:spacing w:before="80" w:line="360" w:lineRule="auto"/>
         <w:jc w:val="both"/>
       </w:pPr>
@@ -2778,13 +2684,12 @@
         <w:rPr>
           <w:rFonts w:eastAsia="Consolas"/>
         </w:rPr>
-        <w:t xml:space="preserve">Сценарій: Межа календарного тижня (REQ-F-027)</w:t>
+        <w:t>Сценарій: Межа календарного тижня (REQ-F-027)</w:t>
       </w:r>
     </w:p>
     <w:p>
       <w:pPr>
         <w:keepLines/>
-        <w:shd w:val="clear" w:color="auto" w:fill="F2F2F2"/>
         <w:spacing w:before="80" w:line="360" w:lineRule="auto"/>
         <w:jc w:val="both"/>
       </w:pPr>
@@ -2798,7 +2703,6 @@
     <w:p>
       <w:pPr>
         <w:keepLines/>
-        <w:shd w:val="clear" w:color="auto" w:fill="F2F2F2"/>
         <w:spacing w:before="80" w:line="360" w:lineRule="auto"/>
         <w:jc w:val="both"/>
       </w:pPr>
@@ -2812,7 +2716,6 @@
     <w:p>
       <w:pPr>
         <w:keepLines/>
-        <w:shd w:val="clear" w:color="auto" w:fill="F2F2F2"/>
         <w:spacing w:before="80" w:line="360" w:lineRule="auto"/>
         <w:jc w:val="both"/>
       </w:pPr>
@@ -2826,7 +2729,6 @@
     <w:p>
       <w:pPr>
         <w:keepLines/>
-        <w:shd w:val="clear" w:color="auto" w:fill="F2F2F2"/>
         <w:spacing w:before="80" w:line="360" w:lineRule="auto"/>
         <w:jc w:val="both"/>
       </w:pPr>
@@ -2854,7 +2756,7 @@
           <w:sz w:val="28"/>
           <w:szCs w:val="28"/>
         </w:rPr>
-        <w:t xml:space="preserve">12. Початкова матриця простежуваності</w:t>
+        <w:t>12. Початкова матриця простежуваності</w:t>
       </w:r>
     </w:p>
     <w:p>
@@ -2864,7 +2766,7 @@
         <w:jc w:val="both"/>
       </w:pPr>
       <w:r>
-        <w:t xml:space="preserve">Матриця зберігається у spec/traceability.md і охоплює всі 55 вимог. Колонки «Тікет», «Тест», «Код» і «Документація» створено заздалегідь і будуть заповнені в наступних роботах.</w:t>
+        <w:t>Матриця зберігається у spec/traceability.md і охоплює всі 55 вимог. Колонки «Тікет», «Тест», «Код» і «Документація» створено заздалегідь і будуть заповнені в наступних роботах.</w:t>
       </w:r>
     </w:p>
     <w:tbl>
@@ -2884,6 +2786,7 @@
           <w:bottom w:w="40" w:type="dxa"/>
           <w:right w:w="80" w:type="dxa"/>
         </w:tblCellMar>
+        <w:tblLook w:val="04A0" w:firstRow="1" w:lastRow="0" w:firstColumn="1" w:lastColumn="0" w:noHBand="0" w:noVBand="1"/>
       </w:tblPr>
       <w:tblGrid>
         <w:gridCol w:w="1500"/>
@@ -2895,84 +2798,68 @@
         <w:tc>
           <w:tcPr>
             <w:tcW w:w="1500" w:type="dxa"/>
-            <w:shd w:val="clear" w:fill="D9E2F3"/>
-          </w:tcPr>
-          <w:p>
-            <w:pPr>
-              <w:spacing w:after="0" w:line="240" w:lineRule="auto"/>
-              <w:ind w:firstLine="0"/>
-              <w:jc w:val="left"/>
+            <w:shd w:val="clear" w:color="auto" w:fill="auto"/>
+          </w:tcPr>
+          <w:p>
+            <w:pPr>
+              <w:spacing w:line="360" w:lineRule="auto"/>
             </w:pPr>
             <w:r>
               <w:rPr>
-                <w:rFonts w:ascii="Times New Roman" w:hAnsi="Times New Roman"/>
-                <w:sz w:val="24"/>
                 <w:b/>
               </w:rPr>
-              <w:t xml:space="preserve">ID</w:t>
+              <w:t>ID</w:t>
             </w:r>
           </w:p>
         </w:tc>
         <w:tc>
           <w:tcPr>
             <w:tcW w:w="2200" w:type="dxa"/>
-            <w:shd w:val="clear" w:fill="D9E2F3"/>
-          </w:tcPr>
-          <w:p>
-            <w:pPr>
-              <w:spacing w:after="0" w:line="240" w:lineRule="auto"/>
-              <w:ind w:firstLine="0"/>
-              <w:jc w:val="left"/>
+            <w:shd w:val="clear" w:color="auto" w:fill="auto"/>
+          </w:tcPr>
+          <w:p>
+            <w:pPr>
+              <w:spacing w:line="360" w:lineRule="auto"/>
             </w:pPr>
             <w:r>
               <w:rPr>
-                <w:rFonts w:ascii="Times New Roman" w:hAnsi="Times New Roman"/>
-                <w:sz w:val="24"/>
                 <w:b/>
               </w:rPr>
-              <w:t xml:space="preserve">Критерій</w:t>
+              <w:t>Критерій</w:t>
             </w:r>
           </w:p>
         </w:tc>
         <w:tc>
           <w:tcPr>
             <w:tcW w:w="4155" w:type="dxa"/>
-            <w:shd w:val="clear" w:fill="D9E2F3"/>
-          </w:tcPr>
-          <w:p>
-            <w:pPr>
-              <w:spacing w:after="0" w:line="240" w:lineRule="auto"/>
-              <w:ind w:firstLine="0"/>
-              <w:jc w:val="left"/>
+            <w:shd w:val="clear" w:color="auto" w:fill="auto"/>
+          </w:tcPr>
+          <w:p>
+            <w:pPr>
+              <w:spacing w:line="360" w:lineRule="auto"/>
             </w:pPr>
             <w:r>
               <w:rPr>
-                <w:rFonts w:ascii="Times New Roman" w:hAnsi="Times New Roman"/>
-                <w:sz w:val="24"/>
                 <w:b/>
               </w:rPr>
-              <w:t xml:space="preserve">BDD-сценарій</w:t>
+              <w:t>BDD-сценарій</w:t>
             </w:r>
           </w:p>
         </w:tc>
         <w:tc>
           <w:tcPr>
             <w:tcW w:w="1500" w:type="dxa"/>
-            <w:shd w:val="clear" w:fill="D9E2F3"/>
-          </w:tcPr>
-          <w:p>
-            <w:pPr>
-              <w:spacing w:after="0" w:line="240" w:lineRule="auto"/>
-              <w:ind w:firstLine="0"/>
-              <w:jc w:val="left"/>
+            <w:shd w:val="clear" w:color="auto" w:fill="auto"/>
+          </w:tcPr>
+          <w:p>
+            <w:pPr>
+              <w:spacing w:line="360" w:lineRule="auto"/>
             </w:pPr>
             <w:r>
               <w:rPr>
-                <w:rFonts w:ascii="Times New Roman" w:hAnsi="Times New Roman"/>
-                <w:sz w:val="24"/>
                 <w:b/>
               </w:rPr>
-              <w:t xml:space="preserve">Тест</w:t>
+              <w:t>Тест</w:t>
             </w:r>
           </w:p>
         </w:tc>
@@ -2984,16 +2871,10 @@
           </w:tcPr>
           <w:p>
             <w:pPr>
-              <w:spacing w:after="0" w:line="240" w:lineRule="auto"/>
-              <w:ind w:firstLine="0"/>
-              <w:jc w:val="left"/>
-            </w:pPr>
-            <w:r>
-              <w:rPr>
-                <w:rFonts w:ascii="Times New Roman" w:hAnsi="Times New Roman"/>
-                <w:sz w:val="24"/>
-              </w:rPr>
-              <w:t xml:space="preserve">REQ-F-006</w:t>
+              <w:spacing w:line="360" w:lineRule="auto"/>
+            </w:pPr>
+            <w:r>
+              <w:t>REQ-F-006</w:t>
             </w:r>
           </w:p>
         </w:tc>
@@ -3003,16 +2884,10 @@
           </w:tcPr>
           <w:p>
             <w:pPr>
-              <w:spacing w:after="0" w:line="240" w:lineRule="auto"/>
-              <w:ind w:firstLine="0"/>
-              <w:jc w:val="left"/>
-            </w:pPr>
-            <w:r>
-              <w:rPr>
-                <w:rFonts w:ascii="Times New Roman" w:hAnsi="Times New Roman"/>
-                <w:sz w:val="24"/>
-              </w:rPr>
-              <w:t xml:space="preserve">КП REQ-F-006</w:t>
+              <w:spacing w:line="360" w:lineRule="auto"/>
+            </w:pPr>
+            <w:r>
+              <w:t>КП REQ-F-006</w:t>
             </w:r>
           </w:p>
         </w:tc>
@@ -3022,16 +2897,10 @@
           </w:tcPr>
           <w:p>
             <w:pPr>
-              <w:spacing w:after="0" w:line="240" w:lineRule="auto"/>
-              <w:ind w:firstLine="0"/>
-              <w:jc w:val="left"/>
-            </w:pPr>
-            <w:r>
-              <w:rPr>
-                <w:rFonts w:ascii="Times New Roman" w:hAnsi="Times New Roman"/>
-                <w:sz w:val="24"/>
-              </w:rPr>
-              <w:t xml:space="preserve">Додавання покупки з кількістю</w:t>
+              <w:spacing w:line="360" w:lineRule="auto"/>
+            </w:pPr>
+            <w:r>
+              <w:t>Додавання покупки з кількістю</w:t>
             </w:r>
           </w:p>
         </w:tc>
@@ -3041,17 +2910,8 @@
           </w:tcPr>
           <w:p>
             <w:pPr>
-              <w:spacing w:after="0" w:line="240" w:lineRule="auto"/>
-              <w:ind w:firstLine="0"/>
-              <w:jc w:val="left"/>
-            </w:pPr>
-            <w:r>
-              <w:rPr>
-                <w:rFonts w:ascii="Times New Roman" w:hAnsi="Times New Roman"/>
-                <w:sz w:val="24"/>
-              </w:rPr>
-              <w:t xml:space="preserve"/>
-            </w:r>
+              <w:spacing w:line="360" w:lineRule="auto"/>
+            </w:pPr>
           </w:p>
         </w:tc>
       </w:tr>
@@ -3062,16 +2922,10 @@
           </w:tcPr>
           <w:p>
             <w:pPr>
-              <w:spacing w:after="0" w:line="240" w:lineRule="auto"/>
-              <w:ind w:firstLine="0"/>
-              <w:jc w:val="left"/>
-            </w:pPr>
-            <w:r>
-              <w:rPr>
-                <w:rFonts w:ascii="Times New Roman" w:hAnsi="Times New Roman"/>
-                <w:sz w:val="24"/>
-              </w:rPr>
-              <w:t xml:space="preserve">REQ-F-013</w:t>
+              <w:spacing w:line="360" w:lineRule="auto"/>
+            </w:pPr>
+            <w:r>
+              <w:t>REQ-F-013</w:t>
             </w:r>
           </w:p>
         </w:tc>
@@ -3081,16 +2935,10 @@
           </w:tcPr>
           <w:p>
             <w:pPr>
-              <w:spacing w:after="0" w:line="240" w:lineRule="auto"/>
-              <w:ind w:firstLine="0"/>
-              <w:jc w:val="left"/>
-            </w:pPr>
-            <w:r>
-              <w:rPr>
-                <w:rFonts w:ascii="Times New Roman" w:hAnsi="Times New Roman"/>
-                <w:sz w:val="24"/>
-              </w:rPr>
-              <w:t xml:space="preserve">КП REQ-F-013</w:t>
+              <w:spacing w:line="360" w:lineRule="auto"/>
+            </w:pPr>
+            <w:r>
+              <w:t>КП REQ-F-013</w:t>
             </w:r>
           </w:p>
         </w:tc>
@@ -3100,16 +2948,10 @@
           </w:tcPr>
           <w:p>
             <w:pPr>
-              <w:spacing w:after="0" w:line="240" w:lineRule="auto"/>
-              <w:ind w:firstLine="0"/>
-              <w:jc w:val="left"/>
-            </w:pPr>
-            <w:r>
-              <w:rPr>
-                <w:rFonts w:ascii="Times New Roman" w:hAnsi="Times New Roman"/>
-                <w:sz w:val="24"/>
-              </w:rPr>
-              <w:t xml:space="preserve">Відмова відʼємної ціни</w:t>
+              <w:spacing w:line="360" w:lineRule="auto"/>
+            </w:pPr>
+            <w:r>
+              <w:t>Відмова відʼємної ціни</w:t>
             </w:r>
           </w:p>
         </w:tc>
@@ -3119,17 +2961,8 @@
           </w:tcPr>
           <w:p>
             <w:pPr>
-              <w:spacing w:after="0" w:line="240" w:lineRule="auto"/>
-              <w:ind w:firstLine="0"/>
-              <w:jc w:val="left"/>
-            </w:pPr>
-            <w:r>
-              <w:rPr>
-                <w:rFonts w:ascii="Times New Roman" w:hAnsi="Times New Roman"/>
-                <w:sz w:val="24"/>
-              </w:rPr>
-              <w:t xml:space="preserve"/>
-            </w:r>
+              <w:spacing w:line="360" w:lineRule="auto"/>
+            </w:pPr>
           </w:p>
         </w:tc>
       </w:tr>
@@ -3140,16 +2973,10 @@
           </w:tcPr>
           <w:p>
             <w:pPr>
-              <w:spacing w:after="0" w:line="240" w:lineRule="auto"/>
-              <w:ind w:firstLine="0"/>
-              <w:jc w:val="left"/>
-            </w:pPr>
-            <w:r>
-              <w:rPr>
-                <w:rFonts w:ascii="Times New Roman" w:hAnsi="Times New Roman"/>
-                <w:sz w:val="24"/>
-              </w:rPr>
-              <w:t xml:space="preserve">REQ-F-024</w:t>
+              <w:spacing w:line="360" w:lineRule="auto"/>
+            </w:pPr>
+            <w:r>
+              <w:t>REQ-F-024</w:t>
             </w:r>
           </w:p>
         </w:tc>
@@ -3159,16 +2986,10 @@
           </w:tcPr>
           <w:p>
             <w:pPr>
-              <w:spacing w:after="0" w:line="240" w:lineRule="auto"/>
-              <w:ind w:firstLine="0"/>
-              <w:jc w:val="left"/>
-            </w:pPr>
-            <w:r>
-              <w:rPr>
-                <w:rFonts w:ascii="Times New Roman" w:hAnsi="Times New Roman"/>
-                <w:sz w:val="24"/>
-              </w:rPr>
-              <w:t xml:space="preserve">КП REQ-F-024</w:t>
+              <w:spacing w:line="360" w:lineRule="auto"/>
+            </w:pPr>
+            <w:r>
+              <w:t>КП REQ-F-024</w:t>
             </w:r>
           </w:p>
         </w:tc>
@@ -3178,16 +2999,10 @@
           </w:tcPr>
           <w:p>
             <w:pPr>
-              <w:spacing w:after="0" w:line="240" w:lineRule="auto"/>
-              <w:ind w:firstLine="0"/>
-              <w:jc w:val="left"/>
-            </w:pPr>
-            <w:r>
-              <w:rPr>
-                <w:rFonts w:ascii="Times New Roman" w:hAnsi="Times New Roman"/>
-                <w:sz w:val="24"/>
-              </w:rPr>
-              <w:t xml:space="preserve">Видалення непорожньої категорії</w:t>
+              <w:spacing w:line="360" w:lineRule="auto"/>
+            </w:pPr>
+            <w:r>
+              <w:t>Видалення непорожньої категорії</w:t>
             </w:r>
           </w:p>
         </w:tc>
@@ -3197,17 +3012,8 @@
           </w:tcPr>
           <w:p>
             <w:pPr>
-              <w:spacing w:after="0" w:line="240" w:lineRule="auto"/>
-              <w:ind w:firstLine="0"/>
-              <w:jc w:val="left"/>
-            </w:pPr>
-            <w:r>
-              <w:rPr>
-                <w:rFonts w:ascii="Times New Roman" w:hAnsi="Times New Roman"/>
-                <w:sz w:val="24"/>
-              </w:rPr>
-              <w:t xml:space="preserve"/>
-            </w:r>
+              <w:spacing w:line="360" w:lineRule="auto"/>
+            </w:pPr>
           </w:p>
         </w:tc>
       </w:tr>
@@ -3218,16 +3024,10 @@
           </w:tcPr>
           <w:p>
             <w:pPr>
-              <w:spacing w:after="0" w:line="240" w:lineRule="auto"/>
-              <w:ind w:firstLine="0"/>
-              <w:jc w:val="left"/>
-            </w:pPr>
-            <w:r>
-              <w:rPr>
-                <w:rFonts w:ascii="Times New Roman" w:hAnsi="Times New Roman"/>
-                <w:sz w:val="24"/>
-              </w:rPr>
-              <w:t xml:space="preserve">REQ-F-027</w:t>
+              <w:spacing w:line="360" w:lineRule="auto"/>
+            </w:pPr>
+            <w:r>
+              <w:t>REQ-F-027</w:t>
             </w:r>
           </w:p>
         </w:tc>
@@ -3237,16 +3037,10 @@
           </w:tcPr>
           <w:p>
             <w:pPr>
-              <w:spacing w:after="0" w:line="240" w:lineRule="auto"/>
-              <w:ind w:firstLine="0"/>
-              <w:jc w:val="left"/>
-            </w:pPr>
-            <w:r>
-              <w:rPr>
-                <w:rFonts w:ascii="Times New Roman" w:hAnsi="Times New Roman"/>
-                <w:sz w:val="24"/>
-              </w:rPr>
-              <w:t xml:space="preserve">КП REQ-F-027</w:t>
+              <w:spacing w:line="360" w:lineRule="auto"/>
+            </w:pPr>
+            <w:r>
+              <w:t>КП REQ-F-027</w:t>
             </w:r>
           </w:p>
         </w:tc>
@@ -3256,16 +3050,10 @@
           </w:tcPr>
           <w:p>
             <w:pPr>
-              <w:spacing w:after="0" w:line="240" w:lineRule="auto"/>
-              <w:ind w:firstLine="0"/>
-              <w:jc w:val="left"/>
-            </w:pPr>
-            <w:r>
-              <w:rPr>
-                <w:rFonts w:ascii="Times New Roman" w:hAnsi="Times New Roman"/>
-                <w:sz w:val="24"/>
-              </w:rPr>
-              <w:t xml:space="preserve">Межа календарного тижня</w:t>
+              <w:spacing w:line="360" w:lineRule="auto"/>
+            </w:pPr>
+            <w:r>
+              <w:t>Межа календарного тижня</w:t>
             </w:r>
           </w:p>
         </w:tc>
@@ -3275,17 +3063,8 @@
           </w:tcPr>
           <w:p>
             <w:pPr>
-              <w:spacing w:after="0" w:line="240" w:lineRule="auto"/>
-              <w:ind w:firstLine="0"/>
-              <w:jc w:val="left"/>
-            </w:pPr>
-            <w:r>
-              <w:rPr>
-                <w:rFonts w:ascii="Times New Roman" w:hAnsi="Times New Roman"/>
-                <w:sz w:val="24"/>
-              </w:rPr>
-              <w:t xml:space="preserve"/>
-            </w:r>
+              <w:spacing w:line="360" w:lineRule="auto"/>
+            </w:pPr>
           </w:p>
         </w:tc>
       </w:tr>
@@ -3296,16 +3075,11 @@
           </w:tcPr>
           <w:p>
             <w:pPr>
-              <w:spacing w:after="0" w:line="240" w:lineRule="auto"/>
-              <w:ind w:firstLine="0"/>
-              <w:jc w:val="left"/>
-            </w:pPr>
-            <w:r>
-              <w:rPr>
-                <w:rFonts w:ascii="Times New Roman" w:hAnsi="Times New Roman"/>
-                <w:sz w:val="24"/>
-              </w:rPr>
-              <w:t xml:space="preserve">REQ-NF-001</w:t>
+              <w:spacing w:line="360" w:lineRule="auto"/>
+            </w:pPr>
+            <w:r>
+              <w:lastRenderedPageBreak/>
+              <w:t>REQ-NF-001</w:t>
             </w:r>
           </w:p>
         </w:tc>
@@ -3315,16 +3089,10 @@
           </w:tcPr>
           <w:p>
             <w:pPr>
-              <w:spacing w:after="0" w:line="240" w:lineRule="auto"/>
-              <w:ind w:firstLine="0"/>
-              <w:jc w:val="left"/>
-            </w:pPr>
-            <w:r>
-              <w:rPr>
-                <w:rFonts w:ascii="Times New Roman" w:hAnsi="Times New Roman"/>
-                <w:sz w:val="24"/>
-              </w:rPr>
-              <w:t xml:space="preserve">КП REQ-NF-001</w:t>
+              <w:spacing w:line="360" w:lineRule="auto"/>
+            </w:pPr>
+            <w:r>
+              <w:t>КП REQ-NF-001</w:t>
             </w:r>
           </w:p>
         </w:tc>
@@ -3334,17 +3102,8 @@
           </w:tcPr>
           <w:p>
             <w:pPr>
-              <w:spacing w:after="0" w:line="240" w:lineRule="auto"/>
-              <w:ind w:firstLine="0"/>
-              <w:jc w:val="left"/>
-            </w:pPr>
-            <w:r>
-              <w:rPr>
-                <w:rFonts w:ascii="Times New Roman" w:hAnsi="Times New Roman"/>
-                <w:sz w:val="24"/>
-              </w:rPr>
-              <w:t xml:space="preserve"/>
-            </w:r>
+              <w:spacing w:line="360" w:lineRule="auto"/>
+            </w:pPr>
           </w:p>
         </w:tc>
         <w:tc>
@@ -3353,17 +3112,8 @@
           </w:tcPr>
           <w:p>
             <w:pPr>
-              <w:spacing w:after="0" w:line="240" w:lineRule="auto"/>
-              <w:ind w:firstLine="0"/>
-              <w:jc w:val="left"/>
-            </w:pPr>
-            <w:r>
-              <w:rPr>
-                <w:rFonts w:ascii="Times New Roman" w:hAnsi="Times New Roman"/>
-                <w:sz w:val="24"/>
-              </w:rPr>
-              <w:t xml:space="preserve"/>
-            </w:r>
+              <w:spacing w:line="360" w:lineRule="auto"/>
+            </w:pPr>
           </w:p>
         </w:tc>
       </w:tr>
@@ -3374,16 +3124,10 @@
           </w:tcPr>
           <w:p>
             <w:pPr>
-              <w:spacing w:after="0" w:line="240" w:lineRule="auto"/>
-              <w:ind w:firstLine="0"/>
-              <w:jc w:val="left"/>
-            </w:pPr>
-            <w:r>
-              <w:rPr>
-                <w:rFonts w:ascii="Times New Roman" w:hAnsi="Times New Roman"/>
-                <w:sz w:val="24"/>
-              </w:rPr>
-              <w:t xml:space="preserve">REQ-NF-005</w:t>
+              <w:spacing w:line="360" w:lineRule="auto"/>
+            </w:pPr>
+            <w:r>
+              <w:t>REQ-NF-005</w:t>
             </w:r>
           </w:p>
         </w:tc>
@@ -3393,16 +3137,10 @@
           </w:tcPr>
           <w:p>
             <w:pPr>
-              <w:spacing w:after="0" w:line="240" w:lineRule="auto"/>
-              <w:ind w:firstLine="0"/>
-              <w:jc w:val="left"/>
-            </w:pPr>
-            <w:r>
-              <w:rPr>
-                <w:rFonts w:ascii="Times New Roman" w:hAnsi="Times New Roman"/>
-                <w:sz w:val="24"/>
-              </w:rPr>
-              <w:t xml:space="preserve">КП REQ-NF-005</w:t>
+              <w:spacing w:line="360" w:lineRule="auto"/>
+            </w:pPr>
+            <w:r>
+              <w:t>КП REQ-NF-005</w:t>
             </w:r>
           </w:p>
         </w:tc>
@@ -3412,17 +3150,8 @@
           </w:tcPr>
           <w:p>
             <w:pPr>
-              <w:spacing w:after="0" w:line="240" w:lineRule="auto"/>
-              <w:ind w:firstLine="0"/>
-              <w:jc w:val="left"/>
-            </w:pPr>
-            <w:r>
-              <w:rPr>
-                <w:rFonts w:ascii="Times New Roman" w:hAnsi="Times New Roman"/>
-                <w:sz w:val="24"/>
-              </w:rPr>
-              <w:t xml:space="preserve"/>
-            </w:r>
+              <w:spacing w:line="360" w:lineRule="auto"/>
+            </w:pPr>
           </w:p>
         </w:tc>
         <w:tc>
@@ -3431,17 +3160,8 @@
           </w:tcPr>
           <w:p>
             <w:pPr>
-              <w:spacing w:after="0" w:line="240" w:lineRule="auto"/>
-              <w:ind w:firstLine="0"/>
-              <w:jc w:val="left"/>
-            </w:pPr>
-            <w:r>
-              <w:rPr>
-                <w:rFonts w:ascii="Times New Roman" w:hAnsi="Times New Roman"/>
-                <w:sz w:val="24"/>
-              </w:rPr>
-              <w:t xml:space="preserve"/>
-            </w:r>
+              <w:spacing w:line="360" w:lineRule="auto"/>
+            </w:pPr>
           </w:p>
         </w:tc>
       </w:tr>
@@ -3463,7 +3183,7 @@
           <w:sz w:val="28"/>
           <w:szCs w:val="28"/>
         </w:rPr>
-        <w:t xml:space="preserve">13. Перевірка специфікації та SPEC-GATE</w:t>
+        <w:t>13. Перевірка специфікації та SPEC-GATE</w:t>
       </w:r>
     </w:p>
     <w:p>
@@ -3473,7 +3193,7 @@
         <w:jc w:val="both"/>
       </w:pPr>
       <w:r>
-        <w:t xml:space="preserve">Перевірку проведено окремим проходом після написання документа: пошук суперечностей, невизначених термінів, неперевірюваних формулювань і вимог без критерію прийняття. Знайдено сім проблем, усі виправлено.</w:t>
+        <w:t>Перевірку проведено окремим проходом після написання документа: пошук суперечностей, невизначених термінів, неперевірюваних формулювань і вимог без критерію прийняття. Знайдено сім проблем, усі виправлено.</w:t>
       </w:r>
     </w:p>
     <w:tbl>
@@ -3493,6 +3213,7 @@
           <w:bottom w:w="40" w:type="dxa"/>
           <w:right w:w="80" w:type="dxa"/>
         </w:tblCellMar>
+        <w:tblLook w:val="04A0" w:firstRow="1" w:lastRow="0" w:firstColumn="1" w:lastColumn="0" w:noHBand="0" w:noVBand="1"/>
       </w:tblPr>
       <w:tblGrid>
         <w:gridCol w:w="4600"/>
@@ -3502,42 +3223,34 @@
         <w:tc>
           <w:tcPr>
             <w:tcW w:w="4600" w:type="dxa"/>
-            <w:shd w:val="clear" w:fill="D9E2F3"/>
-          </w:tcPr>
-          <w:p>
-            <w:pPr>
-              <w:spacing w:after="0" w:line="240" w:lineRule="auto"/>
-              <w:ind w:firstLine="0"/>
-              <w:jc w:val="left"/>
+            <w:shd w:val="clear" w:color="auto" w:fill="auto"/>
+          </w:tcPr>
+          <w:p>
+            <w:pPr>
+              <w:spacing w:line="360" w:lineRule="auto"/>
             </w:pPr>
             <w:r>
               <w:rPr>
-                <w:rFonts w:ascii="Times New Roman" w:hAnsi="Times New Roman"/>
-                <w:sz w:val="24"/>
                 <w:b/>
               </w:rPr>
-              <w:t xml:space="preserve">Проблема</w:t>
+              <w:t>Проблема</w:t>
             </w:r>
           </w:p>
         </w:tc>
         <w:tc>
           <w:tcPr>
             <w:tcW w:w="4755" w:type="dxa"/>
-            <w:shd w:val="clear" w:fill="D9E2F3"/>
-          </w:tcPr>
-          <w:p>
-            <w:pPr>
-              <w:spacing w:after="0" w:line="240" w:lineRule="auto"/>
-              <w:ind w:firstLine="0"/>
-              <w:jc w:val="left"/>
+            <w:shd w:val="clear" w:color="auto" w:fill="auto"/>
+          </w:tcPr>
+          <w:p>
+            <w:pPr>
+              <w:spacing w:line="360" w:lineRule="auto"/>
             </w:pPr>
             <w:r>
               <w:rPr>
-                <w:rFonts w:ascii="Times New Roman" w:hAnsi="Times New Roman"/>
-                <w:sz w:val="24"/>
                 <w:b/>
               </w:rPr>
-              <w:t xml:space="preserve">Рішення</w:t>
+              <w:t>Рішення</w:t>
             </w:r>
           </w:p>
         </w:tc>
@@ -3549,16 +3262,10 @@
           </w:tcPr>
           <w:p>
             <w:pPr>
-              <w:spacing w:after="0" w:line="240" w:lineRule="auto"/>
-              <w:ind w:firstLine="0"/>
-              <w:jc w:val="left"/>
-            </w:pPr>
-            <w:r>
-              <w:rPr>
-                <w:rFonts w:ascii="Times New Roman" w:hAnsi="Times New Roman"/>
-                <w:sz w:val="24"/>
-              </w:rPr>
-              <w:t xml:space="preserve">Суперечність: одна вимога дозволяла перейменувати будь-яку категорію, інша переносила покупки до категорії «Інше»</w:t>
+              <w:spacing w:line="360" w:lineRule="auto"/>
+            </w:pPr>
+            <w:r>
+              <w:t>Суперечність: одна вимога дозволяла перейменувати будь-яку категорію, інша переносила покупки до категорії «Інше»</w:t>
             </w:r>
           </w:p>
         </w:tc>
@@ -3568,16 +3275,10 @@
           </w:tcPr>
           <w:p>
             <w:pPr>
-              <w:spacing w:after="0" w:line="240" w:lineRule="auto"/>
-              <w:ind w:firstLine="0"/>
-              <w:jc w:val="left"/>
-            </w:pPr>
-            <w:r>
-              <w:rPr>
-                <w:rFonts w:ascii="Times New Roman" w:hAnsi="Times New Roman"/>
-                <w:sz w:val="24"/>
-              </w:rPr>
-              <w:t xml:space="preserve">Додано REQ-F-025: «Інше» є службовою категорією, її не можна видалити чи перейменувати</w:t>
+              <w:spacing w:line="360" w:lineRule="auto"/>
+            </w:pPr>
+            <w:r>
+              <w:t>Додано REQ-F-025: «Інше» є службовою категорією, її не можна видалити чи перейменувати</w:t>
             </w:r>
           </w:p>
         </w:tc>
@@ -3589,16 +3290,10 @@
           </w:tcPr>
           <w:p>
             <w:pPr>
-              <w:spacing w:after="0" w:line="240" w:lineRule="auto"/>
-              <w:ind w:firstLine="0"/>
-              <w:jc w:val="left"/>
-            </w:pPr>
-            <w:r>
-              <w:rPr>
-                <w:rFonts w:ascii="Times New Roman" w:hAnsi="Times New Roman"/>
-                <w:sz w:val="24"/>
-              </w:rPr>
-              <w:t xml:space="preserve">Не вказано правило заокруглення вартості</w:t>
+              <w:spacing w:line="360" w:lineRule="auto"/>
+            </w:pPr>
+            <w:r>
+              <w:t>Не вказано правило заокруглення вартості</w:t>
             </w:r>
           </w:p>
         </w:tc>
@@ -3608,16 +3303,10 @@
           </w:tcPr>
           <w:p>
             <w:pPr>
-              <w:spacing w:after="0" w:line="240" w:lineRule="auto"/>
-              <w:ind w:firstLine="0"/>
-              <w:jc w:val="left"/>
-            </w:pPr>
-            <w:r>
-              <w:rPr>
-                <w:rFonts w:ascii="Times New Roman" w:hAnsi="Times New Roman"/>
-                <w:sz w:val="24"/>
-              </w:rPr>
-              <w:t xml:space="preserve">Уточнено: математичне заокруглення, половина вгору</w:t>
+              <w:spacing w:line="360" w:lineRule="auto"/>
+            </w:pPr>
+            <w:r>
+              <w:t>Уточнено: математичне заокруглення, половина вгору</w:t>
             </w:r>
           </w:p>
         </w:tc>
@@ -3629,16 +3318,10 @@
           </w:tcPr>
           <w:p>
             <w:pPr>
-              <w:spacing w:after="0" w:line="240" w:lineRule="auto"/>
-              <w:ind w:firstLine="0"/>
-              <w:jc w:val="left"/>
-            </w:pPr>
-            <w:r>
-              <w:rPr>
-                <w:rFonts w:ascii="Times New Roman" w:hAnsi="Times New Roman"/>
-                <w:sz w:val="24"/>
-              </w:rPr>
-              <w:t xml:space="preserve">Для ціни точність задана, для дробової кількості - ні</w:t>
+              <w:spacing w:line="360" w:lineRule="auto"/>
+            </w:pPr>
+            <w:r>
+              <w:t>Для ціни точність задана, для дробової кількості - ні</w:t>
             </w:r>
           </w:p>
         </w:tc>
@@ -3648,16 +3331,13 @@
           </w:tcPr>
           <w:p>
             <w:pPr>
-              <w:spacing w:after="0" w:line="240" w:lineRule="auto"/>
-              <w:ind w:firstLine="0"/>
-              <w:jc w:val="left"/>
-            </w:pPr>
-            <w:r>
-              <w:rPr>
-                <w:rFonts w:ascii="Times New Roman" w:hAnsi="Times New Roman"/>
-                <w:sz w:val="24"/>
-              </w:rPr>
-              <w:t xml:space="preserve">Додано REQ-F-018: кількість до трьох знаків після коми</w:t>
+              <w:spacing w:line="360" w:lineRule="auto"/>
+            </w:pPr>
+            <w:r>
+              <w:t>Додано REQ-F-018: кіл</w:t>
+            </w:r>
+            <w:r>
+              <w:t>ькість до трьох знаків після коми</w:t>
             </w:r>
           </w:p>
         </w:tc>
@@ -3669,16 +3349,10 @@
           </w:tcPr>
           <w:p>
             <w:pPr>
-              <w:spacing w:after="0" w:line="240" w:lineRule="auto"/>
-              <w:ind w:firstLine="0"/>
-              <w:jc w:val="left"/>
-            </w:pPr>
-            <w:r>
-              <w:rPr>
-                <w:rFonts w:ascii="Times New Roman" w:hAnsi="Times New Roman"/>
-                <w:sz w:val="24"/>
-              </w:rPr>
-              <w:t xml:space="preserve">«Дата не в майбутньому» не враховувала час</w:t>
+              <w:spacing w:line="360" w:lineRule="auto"/>
+            </w:pPr>
+            <w:r>
+              <w:t>«Дата не в майбутньому» не враховувала час</w:t>
             </w:r>
           </w:p>
         </w:tc>
@@ -3688,16 +3362,10 @@
           </w:tcPr>
           <w:p>
             <w:pPr>
-              <w:spacing w:after="0" w:line="240" w:lineRule="auto"/>
-              <w:ind w:firstLine="0"/>
-              <w:jc w:val="left"/>
-            </w:pPr>
-            <w:r>
-              <w:rPr>
-                <w:rFonts w:ascii="Times New Roman" w:hAnsi="Times New Roman"/>
-                <w:sz w:val="24"/>
-              </w:rPr>
-              <w:t xml:space="preserve">Переформульовано через дату й час</w:t>
+              <w:spacing w:line="360" w:lineRule="auto"/>
+            </w:pPr>
+            <w:r>
+              <w:t>Переформульовано через дату й час</w:t>
             </w:r>
           </w:p>
         </w:tc>
@@ -3709,16 +3377,10 @@
           </w:tcPr>
           <w:p>
             <w:pPr>
-              <w:spacing w:after="0" w:line="240" w:lineRule="auto"/>
-              <w:ind w:firstLine="0"/>
-              <w:jc w:val="left"/>
-            </w:pPr>
-            <w:r>
-              <w:rPr>
-                <w:rFonts w:ascii="Times New Roman" w:hAnsi="Times New Roman"/>
-                <w:sz w:val="24"/>
-              </w:rPr>
-              <w:t xml:space="preserve">Неперевірюване формулювання про втрату незбереженого запису</w:t>
+              <w:spacing w:line="360" w:lineRule="auto"/>
+            </w:pPr>
+            <w:r>
+              <w:t>Неперевірюване формулювання про втрату незбереженого запису</w:t>
             </w:r>
           </w:p>
         </w:tc>
@@ -3728,16 +3390,10 @@
           </w:tcPr>
           <w:p>
             <w:pPr>
-              <w:spacing w:after="0" w:line="240" w:lineRule="auto"/>
-              <w:ind w:firstLine="0"/>
-              <w:jc w:val="left"/>
-            </w:pPr>
-            <w:r>
-              <w:rPr>
-                <w:rFonts w:ascii="Times New Roman" w:hAnsi="Times New Roman"/>
-                <w:sz w:val="24"/>
-              </w:rPr>
-              <w:t xml:space="preserve">Переформульовано: покупка записується до бази в момент підтвердження форми</w:t>
+              <w:spacing w:line="360" w:lineRule="auto"/>
+            </w:pPr>
+            <w:r>
+              <w:t>Переформульовано: покупка записується до бази в момент підтвердження форми</w:t>
             </w:r>
           </w:p>
         </w:tc>
@@ -3749,16 +3405,10 @@
           </w:tcPr>
           <w:p>
             <w:pPr>
-              <w:spacing w:after="0" w:line="240" w:lineRule="auto"/>
-              <w:ind w:firstLine="0"/>
-              <w:jc w:val="left"/>
-            </w:pPr>
-            <w:r>
-              <w:rPr>
-                <w:rFonts w:ascii="Times New Roman" w:hAnsi="Times New Roman"/>
-                <w:sz w:val="24"/>
-              </w:rPr>
-              <w:t xml:space="preserve">Неперевірюване формулювання про підтримку двох мов</w:t>
+              <w:spacing w:line="360" w:lineRule="auto"/>
+            </w:pPr>
+            <w:r>
+              <w:t>Неперевірюване формулювання про підтримку двох мов</w:t>
             </w:r>
           </w:p>
         </w:tc>
@@ -3768,16 +3418,10 @@
           </w:tcPr>
           <w:p>
             <w:pPr>
-              <w:spacing w:after="0" w:line="240" w:lineRule="auto"/>
-              <w:ind w:firstLine="0"/>
-              <w:jc w:val="left"/>
-            </w:pPr>
-            <w:r>
-              <w:rPr>
-                <w:rFonts w:ascii="Times New Roman" w:hAnsi="Times New Roman"/>
-                <w:sz w:val="24"/>
-              </w:rPr>
-              <w:t xml:space="preserve">Переформульовано через файли перекладів, додано критерій</w:t>
+              <w:spacing w:line="360" w:lineRule="auto"/>
+            </w:pPr>
+            <w:r>
+              <w:t>Переформульовано через файли перекладів, додано критерій</w:t>
             </w:r>
           </w:p>
         </w:tc>
@@ -3789,16 +3433,13 @@
           </w:tcPr>
           <w:p>
             <w:pPr>
-              <w:spacing w:after="0" w:line="240" w:lineRule="auto"/>
-              <w:ind w:firstLine="0"/>
-              <w:jc w:val="left"/>
-            </w:pPr>
-            <w:r>
-              <w:rPr>
-                <w:rFonts w:ascii="Times New Roman" w:hAnsi="Times New Roman"/>
-                <w:sz w:val="24"/>
-              </w:rPr>
-              <w:t xml:space="preserve">Вимоги без критеріїв: графіки, експорт CSV, точність кількості, службова категорія</w:t>
+              <w:spacing w:line="360" w:lineRule="auto"/>
+            </w:pPr>
+            <w:r>
+              <w:t>Вимоги без критеріїв: графіки, експорт CSV, точність кількості, службов</w:t>
+            </w:r>
+            <w:r>
+              <w:t>а категорія</w:t>
             </w:r>
           </w:p>
         </w:tc>
@@ -3808,16 +3449,10 @@
           </w:tcPr>
           <w:p>
             <w:pPr>
-              <w:spacing w:after="0" w:line="240" w:lineRule="auto"/>
-              <w:ind w:firstLine="0"/>
-              <w:jc w:val="left"/>
-            </w:pPr>
-            <w:r>
-              <w:rPr>
-                <w:rFonts w:ascii="Times New Roman" w:hAnsi="Times New Roman"/>
-                <w:sz w:val="24"/>
-              </w:rPr>
-              <w:t xml:space="preserve">Додано шість критеріїв прийняття</w:t>
+              <w:spacing w:line="360" w:lineRule="auto"/>
+            </w:pPr>
+            <w:r>
+              <w:t>Додано шість критеріїв прийняття</w:t>
             </w:r>
           </w:p>
         </w:tc>
@@ -3830,7 +3465,8 @@
         <w:jc w:val="both"/>
       </w:pPr>
       <w:r>
-        <w:t xml:space="preserve">Рішення контрольної точки - пройдено; запис збережено у logs/spec-gate.md. Відкритим залишилося питання ВП-01: чи потрібне видалення профілю разом з усіма його покупками. До його закриття система видалення профілю не виконує.</w:t>
+        <w:lastRenderedPageBreak/>
+        <w:t>Рішення контрольної точки - пройдено; запис збережено у logs/spec-gate.md. Відкритим залишилося питання ВП-01: чи потрібне видалення профілю разом з усіма його покупками. До його закриття система видалення профілю не виконує.</w:t>
       </w:r>
     </w:p>
     <w:p>
@@ -3844,7 +3480,7 @@
           <w:noProof/>
         </w:rPr>
         <w:drawing>
-          <wp:inline distT="0" distB="0" distL="0" distR="0" wp14:anchorId="323B3B59" wp14:editId="2560A23F">
+          <wp:inline distT="0" distB="0" distL="0" distR="0" wp14:anchorId="30152D12" wp14:editId="376ED678">
             <wp:extent cx="5749700" cy="6840000"/>
             <wp:effectExtent l="0" t="0" r="0" b="0"/>
             <wp:docPr id="902" name="Picture 902"/>
@@ -3861,7 +3497,7 @@
                     </pic:cNvPicPr>
                   </pic:nvPicPr>
                   <pic:blipFill>
-                    <a:blip r:embed="rIdL23"/>
+                    <a:blip r:embed="rId11"/>
                     <a:srcRect/>
                     <a:stretch>
                       <a:fillRect/>
@@ -3889,8 +3525,27 @@
         <w:jc w:val="center"/>
       </w:pPr>
       <w:r>
-        <w:t xml:space="preserve">Рисунок 2 - Виправлення після перевірки, коміт SPEC-GATE і історія комітів</w:t>
-      </w:r>
+        <w:t xml:space="preserve">Рисунок 6 - Виправлення після перевірки, коміт SPEC-GATE і </w:t>
+      </w:r>
+      <w:proofErr w:type="spellStart"/>
+      <w:r>
+        <w:t>історія</w:t>
+      </w:r>
+      <w:proofErr w:type="spellEnd"/>
+      <w:r>
+        <w:t xml:space="preserve"> </w:t>
+      </w:r>
+      <w:proofErr w:type="spellStart"/>
+      <w:r>
+        <w:t>комітів</w:t>
+      </w:r>
+      <w:proofErr w:type="spellEnd"/>
+    </w:p>
+    <w:p>
+      <w:pPr>
+        <w:spacing w:after="200" w:line="360" w:lineRule="auto"/>
+        <w:jc w:val="center"/>
+      </w:pPr>
     </w:p>
     <w:p>
       <w:pPr>
@@ -3909,7 +3564,8 @@
           <w:sz w:val="28"/>
           <w:szCs w:val="28"/>
         </w:rPr>
-        <w:t xml:space="preserve">14. Затверджена базова версія</w:t>
+        <w:lastRenderedPageBreak/>
+        <w:t>14. Затверджена базова версія</w:t>
       </w:r>
     </w:p>
     <w:p>
@@ -3919,7 +3575,7 @@
         <w:jc w:val="both"/>
       </w:pPr>
       <w:r>
-        <w:t xml:space="preserve">Базову специфікацію зафіксовано комітом c13efc2 gate: approve baseline specification у репозиторії https://github.com/d1aboli/food-expenses-is. Артефакти роботи:</w:t>
+        <w:t>Базову специфікацію зафіксовано комітом c13efc2 gate: approve baseline specification у репозиторії https://github.com/d1aboli/food-expenses-is. Артефакти роботи:</w:t>
       </w:r>
     </w:p>
     <w:p>
@@ -3933,7 +3589,7 @@
         <w:jc w:val="both"/>
       </w:pPr>
       <w:r>
-        <w:t xml:space="preserve">spec/idea.md - оновлений початковий задум;</w:t>
+        <w:t>spec/idea.md - оновлений початковий задум;</w:t>
       </w:r>
     </w:p>
     <w:p>
@@ -3947,7 +3603,7 @@
         <w:jc w:val="both"/>
       </w:pPr>
       <w:r>
-        <w:t xml:space="preserve">spec/srs.tex - базова SRS версії 1.0;</w:t>
+        <w:t>spec/srs.tex - базова SRS версії 1.0;</w:t>
       </w:r>
     </w:p>
     <w:p>
@@ -3961,7 +3617,7 @@
         <w:jc w:val="both"/>
       </w:pPr>
       <w:r>
-        <w:t xml:space="preserve">spec/glossary.md - глосарій предметної області;</w:t>
+        <w:t>spec/glossary.md - глосарій предметної області;</w:t>
       </w:r>
     </w:p>
     <w:p>
@@ -3975,7 +3631,7 @@
         <w:jc w:val="both"/>
       </w:pPr>
       <w:r>
-        <w:t xml:space="preserve">spec/scenarios/expenses.feature - BDD-сценарії;</w:t>
+        <w:t>spec/scenarios/expenses.feature - BDD-сценарії;</w:t>
       </w:r>
     </w:p>
     <w:p>
@@ -3989,7 +3645,7 @@
         <w:jc w:val="both"/>
       </w:pPr>
       <w:r>
-        <w:t xml:space="preserve">spec/traceability.md - початкова матриця простежуваності;</w:t>
+        <w:t>spec/traceability.md - початкова матриця простежуваності;</w:t>
       </w:r>
     </w:p>
     <w:p>
@@ -4003,7 +3659,7 @@
         <w:jc w:val="both"/>
       </w:pPr>
       <w:r>
-        <w:t xml:space="preserve">logs/sked-session-01.md - підсумок SKED-діалогу;</w:t>
+        <w:t>logs/sked-session-01.md - підсумок SKED-діалогу;</w:t>
       </w:r>
     </w:p>
     <w:p>
@@ -4017,7 +3673,7 @@
         <w:jc w:val="both"/>
       </w:pPr>
       <w:r>
-        <w:t xml:space="preserve">logs/spec-gate.md - запис рішення SPEC-GATE.</w:t>
+        <w:t>logs/spec-gate.md - запис рішення SPEC-GATE.</w:t>
       </w:r>
     </w:p>
     <w:p>
@@ -4037,7 +3693,7 @@
           <w:sz w:val="28"/>
           <w:szCs w:val="28"/>
         </w:rPr>
-        <w:t xml:space="preserve">Висновки</w:t>
+        <w:t>Висновки</w:t>
       </w:r>
     </w:p>
     <w:p>
@@ -4047,7 +3703,12 @@
         <w:jc w:val="both"/>
       </w:pPr>
       <w:r>
-        <w:t xml:space="preserve">Специфікація, побудована в діалозі, відрізняється від згенерованої одним запитом тим, що в ній зафіксовані рішення, а не припущення. Модель кілька разів пропонувала те, чого в задумі не було: автентифікацію з паролем, діаграму замість таблиці, верхню межу суми. Кожну таку пропозицію довелося або прийняти свідомо, або відхилити, і саме це відділяє вимоги від домислювання.</w:t>
+        <w:t>Специфікація, побудована в діалозі, відрізняється від згенерованої одним запитом тим, що в ній зафіксовані рішення, а не припущення. Модель кілька разів пропон</w:t>
+      </w:r>
+      <w:bookmarkStart w:id="0" w:name="_GoBack"/>
+      <w:bookmarkEnd w:id="0"/>
+      <w:r>
+        <w:t>увала те, чого в задумі не було: автентифікацію з паролем, діаграму замість таблиці, верхню межу суми. Кожну таку пропозицію довелося або прийняти свідомо, або відхилити, і саме це відділяє вимоги від домислювання.</w:t>
       </w:r>
     </w:p>
     <w:p>
@@ -4057,7 +3718,7 @@
         <w:jc w:val="both"/>
       </w:pPr>
       <w:r>
-        <w:t xml:space="preserve">Перевірка документа окремим проходом виявила суперечність і кілька неперевірюваних формулювань, які під час написання не були помітні. Це підтверджує, що специфікація є таким самим артефактом, що потребує рецензування, як і код. Вимоги щодо TDD і журналювання роблять перевірюваною саму роботу кодингового агента в наступних лабораторних роботах.</w:t>
+        <w:t>Перевірка документа окремим проходом виявила суперечність і кілька неперевірюваних формулювань, які під час написання не були помітні. Це підтверджує, що специфікація є таким самим артефактом, що потребує рецензування, як і код. Вимоги щодо TDD і журналювання роблять перевірюваною саму роботу кодингового агента в наступних лабораторних роботах.</w:t>
       </w:r>
     </w:p>
     <w:sectPr>

</xml_diff>